<commit_message>
Update the delivery pipeline note
</commit_message>
<xml_diff>
--- a/report/503073_Midterm_Report_Docker.docx
+++ b/report/503073_Midterm_Report_Docker.docx
@@ -1689,7 +1689,7 @@
       <w:r>
         <w:fldChar w:fldCharType="separate"/>
       </w:r>
-      <w:hyperlink w:anchor="_Toc244302249" w:history="1">
+      <w:hyperlink w:anchor="_Toc244304508" w:history="1">
         <w:r>
           <w:rPr>
             <w:rStyle w:val="Siuktni"/>
@@ -1716,7 +1716,7 @@
             <w:noProof/>
             <w:webHidden/>
           </w:rPr>
-          <w:instrText xml:space="preserve"> PAGEREF _Toc244302249 \h </w:instrText>
+          <w:instrText xml:space="preserve"> PAGEREF _Toc244304508 \h </w:instrText>
         </w:r>
         <w:r>
           <w:rPr>
@@ -1759,7 +1759,7 @@
           <w14:ligatures w14:val="standardContextual"/>
         </w:rPr>
       </w:pPr>
-      <w:hyperlink w:anchor="_Toc244302250" w:history="1">
+      <w:hyperlink w:anchor="_Toc244304509" w:history="1">
         <w:r>
           <w:rPr>
             <w:rStyle w:val="Siuktni"/>
@@ -1786,7 +1786,7 @@
             <w:noProof/>
             <w:webHidden/>
           </w:rPr>
-          <w:instrText xml:space="preserve"> PAGEREF _Toc244302250 \h </w:instrText>
+          <w:instrText xml:space="preserve"> PAGEREF _Toc244304509 \h </w:instrText>
         </w:r>
         <w:r>
           <w:rPr>
@@ -1829,7 +1829,7 @@
           <w14:ligatures w14:val="standardContextual"/>
         </w:rPr>
       </w:pPr>
-      <w:hyperlink w:anchor="_Toc244302251" w:history="1">
+      <w:hyperlink w:anchor="_Toc244304510" w:history="1">
         <w:r>
           <w:rPr>
             <w:rStyle w:val="Siuktni"/>
@@ -1856,7 +1856,7 @@
             <w:noProof/>
             <w:webHidden/>
           </w:rPr>
-          <w:instrText xml:space="preserve"> PAGEREF _Toc244302251 \h </w:instrText>
+          <w:instrText xml:space="preserve"> PAGEREF _Toc244304510 \h </w:instrText>
         </w:r>
         <w:r>
           <w:rPr>
@@ -1899,7 +1899,7 @@
           <w14:ligatures w14:val="standardContextual"/>
         </w:rPr>
       </w:pPr>
-      <w:hyperlink w:anchor="_Toc244302252" w:history="1">
+      <w:hyperlink w:anchor="_Toc244304511" w:history="1">
         <w:r>
           <w:rPr>
             <w:rStyle w:val="Siuktni"/>
@@ -1926,7 +1926,7 @@
             <w:noProof/>
             <w:webHidden/>
           </w:rPr>
-          <w:instrText xml:space="preserve"> PAGEREF _Toc244302252 \h </w:instrText>
+          <w:instrText xml:space="preserve"> PAGEREF _Toc244304511 \h </w:instrText>
         </w:r>
         <w:r>
           <w:rPr>
@@ -1968,7 +1968,7 @@
           <w14:ligatures w14:val="standardContextual"/>
         </w:rPr>
       </w:pPr>
-      <w:hyperlink w:anchor="_Toc244302253" w:history="1">
+      <w:hyperlink w:anchor="_Toc244304512" w:history="1">
         <w:r>
           <w:rPr>
             <w:rStyle w:val="Siuktni"/>
@@ -1995,7 +1995,7 @@
             <w:noProof/>
             <w:webHidden/>
           </w:rPr>
-          <w:instrText xml:space="preserve"> PAGEREF _Toc244302253 \h </w:instrText>
+          <w:instrText xml:space="preserve"> PAGEREF _Toc244304512 \h </w:instrText>
         </w:r>
         <w:r>
           <w:rPr>
@@ -2037,7 +2037,7 @@
           <w14:ligatures w14:val="standardContextual"/>
         </w:rPr>
       </w:pPr>
-      <w:hyperlink w:anchor="_Toc244302254" w:history="1">
+      <w:hyperlink w:anchor="_Toc244304513" w:history="1">
         <w:r>
           <w:rPr>
             <w:rStyle w:val="Siuktni"/>
@@ -2064,7 +2064,7 @@
             <w:noProof/>
             <w:webHidden/>
           </w:rPr>
-          <w:instrText xml:space="preserve"> PAGEREF _Toc244302254 \h </w:instrText>
+          <w:instrText xml:space="preserve"> PAGEREF _Toc244304513 \h </w:instrText>
         </w:r>
         <w:r>
           <w:rPr>
@@ -2106,7 +2106,7 @@
           <w14:ligatures w14:val="standardContextual"/>
         </w:rPr>
       </w:pPr>
-      <w:hyperlink w:anchor="_Toc244302255" w:history="1">
+      <w:hyperlink w:anchor="_Toc244304514" w:history="1">
         <w:r>
           <w:rPr>
             <w:rStyle w:val="Siuktni"/>
@@ -2133,7 +2133,7 @@
             <w:noProof/>
             <w:webHidden/>
           </w:rPr>
-          <w:instrText xml:space="preserve"> PAGEREF _Toc244302255 \h </w:instrText>
+          <w:instrText xml:space="preserve"> PAGEREF _Toc244304514 \h </w:instrText>
         </w:r>
         <w:r>
           <w:rPr>
@@ -2175,7 +2175,7 @@
           <w14:ligatures w14:val="standardContextual"/>
         </w:rPr>
       </w:pPr>
-      <w:hyperlink w:anchor="_Toc244302256" w:history="1">
+      <w:hyperlink w:anchor="_Toc244304515" w:history="1">
         <w:r>
           <w:rPr>
             <w:rStyle w:val="Siuktni"/>
@@ -2202,7 +2202,7 @@
             <w:noProof/>
             <w:webHidden/>
           </w:rPr>
-          <w:instrText xml:space="preserve"> PAGEREF _Toc244302256 \h </w:instrText>
+          <w:instrText xml:space="preserve"> PAGEREF _Toc244304515 \h </w:instrText>
         </w:r>
         <w:r>
           <w:rPr>
@@ -2245,7 +2245,7 @@
           <w14:ligatures w14:val="standardContextual"/>
         </w:rPr>
       </w:pPr>
-      <w:hyperlink w:anchor="_Toc244302257" w:history="1">
+      <w:hyperlink w:anchor="_Toc244304516" w:history="1">
         <w:r>
           <w:rPr>
             <w:rStyle w:val="Siuktni"/>
@@ -2272,7 +2272,7 @@
             <w:noProof/>
             <w:webHidden/>
           </w:rPr>
-          <w:instrText xml:space="preserve"> PAGEREF _Toc244302257 \h </w:instrText>
+          <w:instrText xml:space="preserve"> PAGEREF _Toc244304516 \h </w:instrText>
         </w:r>
         <w:r>
           <w:rPr>
@@ -2314,7 +2314,7 @@
           <w14:ligatures w14:val="standardContextual"/>
         </w:rPr>
       </w:pPr>
-      <w:hyperlink w:anchor="_Toc244302258" w:history="1">
+      <w:hyperlink w:anchor="_Toc244304517" w:history="1">
         <w:r>
           <w:rPr>
             <w:rStyle w:val="Siuktni"/>
@@ -2341,7 +2341,7 @@
             <w:noProof/>
             <w:webHidden/>
           </w:rPr>
-          <w:instrText xml:space="preserve"> PAGEREF _Toc244302258 \h </w:instrText>
+          <w:instrText xml:space="preserve"> PAGEREF _Toc244304517 \h </w:instrText>
         </w:r>
         <w:r>
           <w:rPr>
@@ -2383,7 +2383,7 @@
           <w14:ligatures w14:val="standardContextual"/>
         </w:rPr>
       </w:pPr>
-      <w:hyperlink w:anchor="_Toc244302259" w:history="1">
+      <w:hyperlink w:anchor="_Toc244304518" w:history="1">
         <w:r>
           <w:rPr>
             <w:rStyle w:val="Siuktni"/>
@@ -2410,7 +2410,7 @@
             <w:noProof/>
             <w:webHidden/>
           </w:rPr>
-          <w:instrText xml:space="preserve"> PAGEREF _Toc244302259 \h </w:instrText>
+          <w:instrText xml:space="preserve"> PAGEREF _Toc244304518 \h </w:instrText>
         </w:r>
         <w:r>
           <w:rPr>
@@ -2453,7 +2453,7 @@
           <w14:ligatures w14:val="standardContextual"/>
         </w:rPr>
       </w:pPr>
-      <w:hyperlink w:anchor="_Toc244302260" w:history="1">
+      <w:hyperlink w:anchor="_Toc244304519" w:history="1">
         <w:r>
           <w:rPr>
             <w:rStyle w:val="Siuktni"/>
@@ -2480,7 +2480,7 @@
             <w:noProof/>
             <w:webHidden/>
           </w:rPr>
-          <w:instrText xml:space="preserve"> PAGEREF _Toc244302260 \h </w:instrText>
+          <w:instrText xml:space="preserve"> PAGEREF _Toc244304519 \h </w:instrText>
         </w:r>
         <w:r>
           <w:rPr>
@@ -2523,7 +2523,7 @@
           <w14:ligatures w14:val="standardContextual"/>
         </w:rPr>
       </w:pPr>
-      <w:hyperlink w:anchor="_Toc244302261" w:history="1">
+      <w:hyperlink w:anchor="_Toc244304520" w:history="1">
         <w:r>
           <w:rPr>
             <w:rStyle w:val="Siuktni"/>
@@ -2550,7 +2550,7 @@
             <w:noProof/>
             <w:webHidden/>
           </w:rPr>
-          <w:instrText xml:space="preserve"> PAGEREF _Toc244302261 \h </w:instrText>
+          <w:instrText xml:space="preserve"> PAGEREF _Toc244304520 \h </w:instrText>
         </w:r>
         <w:r>
           <w:rPr>
@@ -2593,7 +2593,7 @@
           <w14:ligatures w14:val="standardContextual"/>
         </w:rPr>
       </w:pPr>
-      <w:hyperlink w:anchor="_Toc244302262" w:history="1">
+      <w:hyperlink w:anchor="_Toc244304521" w:history="1">
         <w:r>
           <w:rPr>
             <w:rStyle w:val="Siuktni"/>
@@ -2620,7 +2620,7 @@
             <w:noProof/>
             <w:webHidden/>
           </w:rPr>
-          <w:instrText xml:space="preserve"> PAGEREF _Toc244302262 \h </w:instrText>
+          <w:instrText xml:space="preserve"> PAGEREF _Toc244304521 \h </w:instrText>
         </w:r>
         <w:r>
           <w:rPr>
@@ -2662,7 +2662,7 @@
           <w14:ligatures w14:val="standardContextual"/>
         </w:rPr>
       </w:pPr>
-      <w:hyperlink w:anchor="_Toc244302263" w:history="1">
+      <w:hyperlink w:anchor="_Toc244304522" w:history="1">
         <w:r>
           <w:rPr>
             <w:rStyle w:val="Siuktni"/>
@@ -2689,7 +2689,7 @@
             <w:noProof/>
             <w:webHidden/>
           </w:rPr>
-          <w:instrText xml:space="preserve"> PAGEREF _Toc244302263 \h </w:instrText>
+          <w:instrText xml:space="preserve"> PAGEREF _Toc244304522 \h </w:instrText>
         </w:r>
         <w:r>
           <w:rPr>
@@ -2731,7 +2731,7 @@
           <w14:ligatures w14:val="standardContextual"/>
         </w:rPr>
       </w:pPr>
-      <w:hyperlink w:anchor="_Toc244302264" w:history="1">
+      <w:hyperlink w:anchor="_Toc244304523" w:history="1">
         <w:r>
           <w:rPr>
             <w:rStyle w:val="Siuktni"/>
@@ -2758,7 +2758,7 @@
             <w:noProof/>
             <w:webHidden/>
           </w:rPr>
-          <w:instrText xml:space="preserve"> PAGEREF _Toc244302264 \h </w:instrText>
+          <w:instrText xml:space="preserve"> PAGEREF _Toc244304523 \h </w:instrText>
         </w:r>
         <w:r>
           <w:rPr>
@@ -2800,7 +2800,7 @@
           <w14:ligatures w14:val="standardContextual"/>
         </w:rPr>
       </w:pPr>
-      <w:hyperlink w:anchor="_Toc244302265" w:history="1">
+      <w:hyperlink w:anchor="_Toc244304524" w:history="1">
         <w:r>
           <w:rPr>
             <w:rStyle w:val="Siuktni"/>
@@ -2827,7 +2827,7 @@
             <w:noProof/>
             <w:webHidden/>
           </w:rPr>
-          <w:instrText xml:space="preserve"> PAGEREF _Toc244302265 \h </w:instrText>
+          <w:instrText xml:space="preserve"> PAGEREF _Toc244304524 \h </w:instrText>
         </w:r>
         <w:r>
           <w:rPr>
@@ -2869,7 +2869,7 @@
           <w14:ligatures w14:val="standardContextual"/>
         </w:rPr>
       </w:pPr>
-      <w:hyperlink w:anchor="_Toc244302266" w:history="1">
+      <w:hyperlink w:anchor="_Toc244304525" w:history="1">
         <w:r>
           <w:rPr>
             <w:rStyle w:val="Siuktni"/>
@@ -2896,7 +2896,7 @@
             <w:noProof/>
             <w:webHidden/>
           </w:rPr>
-          <w:instrText xml:space="preserve"> PAGEREF _Toc244302266 \h </w:instrText>
+          <w:instrText xml:space="preserve"> PAGEREF _Toc244304525 \h </w:instrText>
         </w:r>
         <w:r>
           <w:rPr>
@@ -2938,7 +2938,7 @@
           <w14:ligatures w14:val="standardContextual"/>
         </w:rPr>
       </w:pPr>
-      <w:hyperlink w:anchor="_Toc244302267" w:history="1">
+      <w:hyperlink w:anchor="_Toc244304526" w:history="1">
         <w:r>
           <w:rPr>
             <w:rStyle w:val="Siuktni"/>
@@ -2965,7 +2965,7 @@
             <w:noProof/>
             <w:webHidden/>
           </w:rPr>
-          <w:instrText xml:space="preserve"> PAGEREF _Toc244302267 \h </w:instrText>
+          <w:instrText xml:space="preserve"> PAGEREF _Toc244304526 \h </w:instrText>
         </w:r>
         <w:r>
           <w:rPr>
@@ -3007,7 +3007,7 @@
           <w14:ligatures w14:val="standardContextual"/>
         </w:rPr>
       </w:pPr>
-      <w:hyperlink w:anchor="_Toc244302268" w:history="1">
+      <w:hyperlink w:anchor="_Toc244304527" w:history="1">
         <w:r>
           <w:rPr>
             <w:rStyle w:val="Siuktni"/>
@@ -3034,7 +3034,7 @@
             <w:noProof/>
             <w:webHidden/>
           </w:rPr>
-          <w:instrText xml:space="preserve"> PAGEREF _Toc244302268 \h </w:instrText>
+          <w:instrText xml:space="preserve"> PAGEREF _Toc244304527 \h </w:instrText>
         </w:r>
         <w:r>
           <w:rPr>
@@ -3076,7 +3076,7 @@
           <w14:ligatures w14:val="standardContextual"/>
         </w:rPr>
       </w:pPr>
-      <w:hyperlink w:anchor="_Toc244302269" w:history="1">
+      <w:hyperlink w:anchor="_Toc244304528" w:history="1">
         <w:r>
           <w:rPr>
             <w:rStyle w:val="Siuktni"/>
@@ -3103,7 +3103,7 @@
             <w:noProof/>
             <w:webHidden/>
           </w:rPr>
-          <w:instrText xml:space="preserve"> PAGEREF _Toc244302269 \h </w:instrText>
+          <w:instrText xml:space="preserve"> PAGEREF _Toc244304528 \h </w:instrText>
         </w:r>
         <w:r>
           <w:rPr>
@@ -3145,7 +3145,7 @@
           <w14:ligatures w14:val="standardContextual"/>
         </w:rPr>
       </w:pPr>
-      <w:hyperlink w:anchor="_Toc244302270" w:history="1">
+      <w:hyperlink w:anchor="_Toc244304529" w:history="1">
         <w:r>
           <w:rPr>
             <w:rStyle w:val="Siuktni"/>
@@ -3172,7 +3172,7 @@
             <w:noProof/>
             <w:webHidden/>
           </w:rPr>
-          <w:instrText xml:space="preserve"> PAGEREF _Toc244302270 \h </w:instrText>
+          <w:instrText xml:space="preserve"> PAGEREF _Toc244304529 \h </w:instrText>
         </w:r>
         <w:r>
           <w:rPr>
@@ -3214,7 +3214,7 @@
           <w14:ligatures w14:val="standardContextual"/>
         </w:rPr>
       </w:pPr>
-      <w:hyperlink w:anchor="_Toc244302271" w:history="1">
+      <w:hyperlink w:anchor="_Toc244304530" w:history="1">
         <w:r>
           <w:rPr>
             <w:rStyle w:val="Siuktni"/>
@@ -3241,7 +3241,7 @@
             <w:noProof/>
             <w:webHidden/>
           </w:rPr>
-          <w:instrText xml:space="preserve"> PAGEREF _Toc244302271 \h </w:instrText>
+          <w:instrText xml:space="preserve"> PAGEREF _Toc244304530 \h </w:instrText>
         </w:r>
         <w:r>
           <w:rPr>
@@ -3284,7 +3284,7 @@
           <w14:ligatures w14:val="standardContextual"/>
         </w:rPr>
       </w:pPr>
-      <w:hyperlink w:anchor="_Toc244302272" w:history="1">
+      <w:hyperlink w:anchor="_Toc244304531" w:history="1">
         <w:r>
           <w:rPr>
             <w:rStyle w:val="Siuktni"/>
@@ -3311,7 +3311,7 @@
             <w:noProof/>
             <w:webHidden/>
           </w:rPr>
-          <w:instrText xml:space="preserve"> PAGEREF _Toc244302272 \h </w:instrText>
+          <w:instrText xml:space="preserve"> PAGEREF _Toc244304531 \h </w:instrText>
         </w:r>
         <w:r>
           <w:rPr>
@@ -3354,7 +3354,7 @@
           <w14:ligatures w14:val="standardContextual"/>
         </w:rPr>
       </w:pPr>
-      <w:hyperlink w:anchor="_Toc244302273" w:history="1">
+      <w:hyperlink w:anchor="_Toc244304532" w:history="1">
         <w:r>
           <w:rPr>
             <w:rStyle w:val="Siuktni"/>
@@ -3381,7 +3381,7 @@
             <w:noProof/>
             <w:webHidden/>
           </w:rPr>
-          <w:instrText xml:space="preserve"> PAGEREF _Toc244302273 \h </w:instrText>
+          <w:instrText xml:space="preserve"> PAGEREF _Toc244304532 \h </w:instrText>
         </w:r>
         <w:r>
           <w:rPr>
@@ -3424,7 +3424,7 @@
           <w14:ligatures w14:val="standardContextual"/>
         </w:rPr>
       </w:pPr>
-      <w:hyperlink w:anchor="_Toc244302274" w:history="1">
+      <w:hyperlink w:anchor="_Toc244304533" w:history="1">
         <w:r>
           <w:rPr>
             <w:rStyle w:val="Siuktni"/>
@@ -3451,7 +3451,7 @@
             <w:noProof/>
             <w:webHidden/>
           </w:rPr>
-          <w:instrText xml:space="preserve"> PAGEREF _Toc244302274 \h </w:instrText>
+          <w:instrText xml:space="preserve"> PAGEREF _Toc244304533 \h </w:instrText>
         </w:r>
         <w:r>
           <w:rPr>
@@ -3494,7 +3494,7 @@
           <w14:ligatures w14:val="standardContextual"/>
         </w:rPr>
       </w:pPr>
-      <w:hyperlink w:anchor="_Toc244302275" w:history="1">
+      <w:hyperlink w:anchor="_Toc244304534" w:history="1">
         <w:r>
           <w:rPr>
             <w:rStyle w:val="Siuktni"/>
@@ -3521,7 +3521,7 @@
             <w:noProof/>
             <w:webHidden/>
           </w:rPr>
-          <w:instrText xml:space="preserve"> PAGEREF _Toc244302275 \h </w:instrText>
+          <w:instrText xml:space="preserve"> PAGEREF _Toc244304534 \h </w:instrText>
         </w:r>
         <w:r>
           <w:rPr>
@@ -3564,7 +3564,7 @@
           <w14:ligatures w14:val="standardContextual"/>
         </w:rPr>
       </w:pPr>
-      <w:hyperlink w:anchor="_Toc244302276" w:history="1">
+      <w:hyperlink w:anchor="_Toc244304535" w:history="1">
         <w:r>
           <w:rPr>
             <w:rStyle w:val="Siuktni"/>
@@ -3591,7 +3591,7 @@
             <w:noProof/>
             <w:webHidden/>
           </w:rPr>
-          <w:instrText xml:space="preserve"> PAGEREF _Toc244302276 \h </w:instrText>
+          <w:instrText xml:space="preserve"> PAGEREF _Toc244304535 \h </w:instrText>
         </w:r>
         <w:r>
           <w:rPr>
@@ -3633,7 +3633,7 @@
           <w14:ligatures w14:val="standardContextual"/>
         </w:rPr>
       </w:pPr>
-      <w:hyperlink w:anchor="_Toc244302277" w:history="1">
+      <w:hyperlink w:anchor="_Toc244304536" w:history="1">
         <w:r>
           <w:rPr>
             <w:rStyle w:val="Siuktni"/>
@@ -3660,7 +3660,7 @@
             <w:noProof/>
             <w:webHidden/>
           </w:rPr>
-          <w:instrText xml:space="preserve"> PAGEREF _Toc244302277 \h </w:instrText>
+          <w:instrText xml:space="preserve"> PAGEREF _Toc244304536 \h </w:instrText>
         </w:r>
         <w:r>
           <w:rPr>
@@ -3703,7 +3703,7 @@
           <w14:ligatures w14:val="standardContextual"/>
         </w:rPr>
       </w:pPr>
-      <w:hyperlink w:anchor="_Toc244302278" w:history="1">
+      <w:hyperlink w:anchor="_Toc244304537" w:history="1">
         <w:r>
           <w:rPr>
             <w:rStyle w:val="Siuktni"/>
@@ -3730,7 +3730,7 @@
             <w:noProof/>
             <w:webHidden/>
           </w:rPr>
-          <w:instrText xml:space="preserve"> PAGEREF _Toc244302278 \h </w:instrText>
+          <w:instrText xml:space="preserve"> PAGEREF _Toc244304537 \h </w:instrText>
         </w:r>
         <w:r>
           <w:rPr>
@@ -3773,7 +3773,7 @@
           <w14:ligatures w14:val="standardContextual"/>
         </w:rPr>
       </w:pPr>
-      <w:hyperlink w:anchor="_Toc244302279" w:history="1">
+      <w:hyperlink w:anchor="_Toc244304538" w:history="1">
         <w:r>
           <w:rPr>
             <w:rStyle w:val="Siuktni"/>
@@ -3800,7 +3800,7 @@
             <w:noProof/>
             <w:webHidden/>
           </w:rPr>
-          <w:instrText xml:space="preserve"> PAGEREF _Toc244302279 \h </w:instrText>
+          <w:instrText xml:space="preserve"> PAGEREF _Toc244304538 \h </w:instrText>
         </w:r>
         <w:r>
           <w:rPr>
@@ -3843,7 +3843,7 @@
           <w14:ligatures w14:val="standardContextual"/>
         </w:rPr>
       </w:pPr>
-      <w:hyperlink w:anchor="_Toc244302280" w:history="1">
+      <w:hyperlink w:anchor="_Toc244304539" w:history="1">
         <w:r>
           <w:rPr>
             <w:rStyle w:val="Siuktni"/>
@@ -3870,7 +3870,7 @@
             <w:noProof/>
             <w:webHidden/>
           </w:rPr>
-          <w:instrText xml:space="preserve"> PAGEREF _Toc244302280 \h </w:instrText>
+          <w:instrText xml:space="preserve"> PAGEREF _Toc244304539 \h </w:instrText>
         </w:r>
         <w:r>
           <w:rPr>
@@ -3912,7 +3912,7 @@
           <w14:ligatures w14:val="standardContextual"/>
         </w:rPr>
       </w:pPr>
-      <w:hyperlink w:anchor="_Toc244302281" w:history="1">
+      <w:hyperlink w:anchor="_Toc244304540" w:history="1">
         <w:r>
           <w:rPr>
             <w:rStyle w:val="Siuktni"/>
@@ -3939,7 +3939,7 @@
             <w:noProof/>
             <w:webHidden/>
           </w:rPr>
-          <w:instrText xml:space="preserve"> PAGEREF _Toc244302281 \h </w:instrText>
+          <w:instrText xml:space="preserve"> PAGEREF _Toc244304540 \h </w:instrText>
         </w:r>
         <w:r>
           <w:rPr>
@@ -3982,7 +3982,7 @@
           <w14:ligatures w14:val="standardContextual"/>
         </w:rPr>
       </w:pPr>
-      <w:hyperlink w:anchor="_Toc244302282" w:history="1">
+      <w:hyperlink w:anchor="_Toc244304541" w:history="1">
         <w:r>
           <w:rPr>
             <w:rStyle w:val="Siuktni"/>
@@ -4009,7 +4009,7 @@
             <w:noProof/>
             <w:webHidden/>
           </w:rPr>
-          <w:instrText xml:space="preserve"> PAGEREF _Toc244302282 \h </w:instrText>
+          <w:instrText xml:space="preserve"> PAGEREF _Toc244304541 \h </w:instrText>
         </w:r>
         <w:r>
           <w:rPr>
@@ -4052,7 +4052,7 @@
           <w14:ligatures w14:val="standardContextual"/>
         </w:rPr>
       </w:pPr>
-      <w:hyperlink w:anchor="_Toc244302283" w:history="1">
+      <w:hyperlink w:anchor="_Toc244304542" w:history="1">
         <w:r>
           <w:rPr>
             <w:rStyle w:val="Siuktni"/>
@@ -4079,7 +4079,7 @@
             <w:noProof/>
             <w:webHidden/>
           </w:rPr>
-          <w:instrText xml:space="preserve"> PAGEREF _Toc244302283 \h </w:instrText>
+          <w:instrText xml:space="preserve"> PAGEREF _Toc244304542 \h </w:instrText>
         </w:r>
         <w:r>
           <w:rPr>
@@ -4122,7 +4122,7 @@
           <w14:ligatures w14:val="standardContextual"/>
         </w:rPr>
       </w:pPr>
-      <w:hyperlink w:anchor="_Toc244302284" w:history="1">
+      <w:hyperlink w:anchor="_Toc244304543" w:history="1">
         <w:r>
           <w:rPr>
             <w:rStyle w:val="Siuktni"/>
@@ -4149,7 +4149,7 @@
             <w:noProof/>
             <w:webHidden/>
           </w:rPr>
-          <w:instrText xml:space="preserve"> PAGEREF _Toc244302284 \h </w:instrText>
+          <w:instrText xml:space="preserve"> PAGEREF _Toc244304543 \h </w:instrText>
         </w:r>
         <w:r>
           <w:rPr>
@@ -4192,7 +4192,7 @@
           <w14:ligatures w14:val="standardContextual"/>
         </w:rPr>
       </w:pPr>
-      <w:hyperlink w:anchor="_Toc244302285" w:history="1">
+      <w:hyperlink w:anchor="_Toc244304544" w:history="1">
         <w:r>
           <w:rPr>
             <w:rStyle w:val="Siuktni"/>
@@ -4219,7 +4219,7 @@
             <w:noProof/>
             <w:webHidden/>
           </w:rPr>
-          <w:instrText xml:space="preserve"> PAGEREF _Toc244302285 \h </w:instrText>
+          <w:instrText xml:space="preserve"> PAGEREF _Toc244304544 \h </w:instrText>
         </w:r>
         <w:r>
           <w:rPr>
@@ -4261,7 +4261,7 @@
           <w14:ligatures w14:val="standardContextual"/>
         </w:rPr>
       </w:pPr>
-      <w:hyperlink w:anchor="_Toc244302286" w:history="1">
+      <w:hyperlink w:anchor="_Toc244304545" w:history="1">
         <w:r>
           <w:rPr>
             <w:rStyle w:val="Siuktni"/>
@@ -4288,7 +4288,7 @@
             <w:noProof/>
             <w:webHidden/>
           </w:rPr>
-          <w:instrText xml:space="preserve"> PAGEREF _Toc244302286 \h </w:instrText>
+          <w:instrText xml:space="preserve"> PAGEREF _Toc244304545 \h </w:instrText>
         </w:r>
         <w:r>
           <w:rPr>
@@ -4331,7 +4331,7 @@
           <w14:ligatures w14:val="standardContextual"/>
         </w:rPr>
       </w:pPr>
-      <w:hyperlink w:anchor="_Toc244302287" w:history="1">
+      <w:hyperlink w:anchor="_Toc244304546" w:history="1">
         <w:r>
           <w:rPr>
             <w:rStyle w:val="Siuktni"/>
@@ -4358,7 +4358,7 @@
             <w:noProof/>
             <w:webHidden/>
           </w:rPr>
-          <w:instrText xml:space="preserve"> PAGEREF _Toc244302287 \h </w:instrText>
+          <w:instrText xml:space="preserve"> PAGEREF _Toc244304546 \h </w:instrText>
         </w:r>
         <w:r>
           <w:rPr>
@@ -4401,7 +4401,7 @@
           <w14:ligatures w14:val="standardContextual"/>
         </w:rPr>
       </w:pPr>
-      <w:hyperlink w:anchor="_Toc244302288" w:history="1">
+      <w:hyperlink w:anchor="_Toc244304547" w:history="1">
         <w:r>
           <w:rPr>
             <w:rStyle w:val="Siuktni"/>
@@ -4428,7 +4428,7 @@
             <w:noProof/>
             <w:webHidden/>
           </w:rPr>
-          <w:instrText xml:space="preserve"> PAGEREF _Toc244302288 \h </w:instrText>
+          <w:instrText xml:space="preserve"> PAGEREF _Toc244304547 \h </w:instrText>
         </w:r>
         <w:r>
           <w:rPr>
@@ -4471,7 +4471,7 @@
           <w14:ligatures w14:val="standardContextual"/>
         </w:rPr>
       </w:pPr>
-      <w:hyperlink w:anchor="_Toc244302289" w:history="1">
+      <w:hyperlink w:anchor="_Toc244304548" w:history="1">
         <w:r>
           <w:rPr>
             <w:rStyle w:val="Siuktni"/>
@@ -4498,7 +4498,7 @@
             <w:noProof/>
             <w:webHidden/>
           </w:rPr>
-          <w:instrText xml:space="preserve"> PAGEREF _Toc244302289 \h </w:instrText>
+          <w:instrText xml:space="preserve"> PAGEREF _Toc244304548 \h </w:instrText>
         </w:r>
         <w:r>
           <w:rPr>
@@ -4541,7 +4541,7 @@
           <w14:ligatures w14:val="standardContextual"/>
         </w:rPr>
       </w:pPr>
-      <w:hyperlink w:anchor="_Toc244302290" w:history="1">
+      <w:hyperlink w:anchor="_Toc244304549" w:history="1">
         <w:r>
           <w:rPr>
             <w:rStyle w:val="Siuktni"/>
@@ -4568,7 +4568,7 @@
             <w:noProof/>
             <w:webHidden/>
           </w:rPr>
-          <w:instrText xml:space="preserve"> PAGEREF _Toc244302290 \h </w:instrText>
+          <w:instrText xml:space="preserve"> PAGEREF _Toc244304549 \h </w:instrText>
         </w:r>
         <w:r>
           <w:rPr>
@@ -4611,7 +4611,7 @@
           <w14:ligatures w14:val="standardContextual"/>
         </w:rPr>
       </w:pPr>
-      <w:hyperlink w:anchor="_Toc244302291" w:history="1">
+      <w:hyperlink w:anchor="_Toc244304550" w:history="1">
         <w:r>
           <w:rPr>
             <w:rStyle w:val="Siuktni"/>
@@ -4638,7 +4638,7 @@
             <w:noProof/>
             <w:webHidden/>
           </w:rPr>
-          <w:instrText xml:space="preserve"> PAGEREF _Toc244302291 \h </w:instrText>
+          <w:instrText xml:space="preserve"> PAGEREF _Toc244304550 \h </w:instrText>
         </w:r>
         <w:r>
           <w:rPr>
@@ -4681,7 +4681,7 @@
           <w14:ligatures w14:val="standardContextual"/>
         </w:rPr>
       </w:pPr>
-      <w:hyperlink w:anchor="_Toc244302292" w:history="1">
+      <w:hyperlink w:anchor="_Toc244304551" w:history="1">
         <w:r>
           <w:rPr>
             <w:rStyle w:val="Siuktni"/>
@@ -4708,7 +4708,7 @@
             <w:noProof/>
             <w:webHidden/>
           </w:rPr>
-          <w:instrText xml:space="preserve"> PAGEREF _Toc244302292 \h </w:instrText>
+          <w:instrText xml:space="preserve"> PAGEREF _Toc244304551 \h </w:instrText>
         </w:r>
         <w:r>
           <w:rPr>
@@ -4751,7 +4751,7 @@
           <w14:ligatures w14:val="standardContextual"/>
         </w:rPr>
       </w:pPr>
-      <w:hyperlink w:anchor="_Toc244302293" w:history="1">
+      <w:hyperlink w:anchor="_Toc244304552" w:history="1">
         <w:r>
           <w:rPr>
             <w:rStyle w:val="Siuktni"/>
@@ -4778,7 +4778,7 @@
             <w:noProof/>
             <w:webHidden/>
           </w:rPr>
-          <w:instrText xml:space="preserve"> PAGEREF _Toc244302293 \h </w:instrText>
+          <w:instrText xml:space="preserve"> PAGEREF _Toc244304552 \h </w:instrText>
         </w:r>
         <w:r>
           <w:rPr>
@@ -4821,7 +4821,7 @@
           <w14:ligatures w14:val="standardContextual"/>
         </w:rPr>
       </w:pPr>
-      <w:hyperlink w:anchor="_Toc244302294" w:history="1">
+      <w:hyperlink w:anchor="_Toc244304553" w:history="1">
         <w:r>
           <w:rPr>
             <w:rStyle w:val="Siuktni"/>
@@ -4848,7 +4848,7 @@
             <w:noProof/>
             <w:webHidden/>
           </w:rPr>
-          <w:instrText xml:space="preserve"> PAGEREF _Toc244302294 \h </w:instrText>
+          <w:instrText xml:space="preserve"> PAGEREF _Toc244304553 \h </w:instrText>
         </w:r>
         <w:r>
           <w:rPr>
@@ -4891,7 +4891,7 @@
           <w14:ligatures w14:val="standardContextual"/>
         </w:rPr>
       </w:pPr>
-      <w:hyperlink w:anchor="_Toc244302295" w:history="1">
+      <w:hyperlink w:anchor="_Toc244304554" w:history="1">
         <w:r>
           <w:rPr>
             <w:rStyle w:val="Siuktni"/>
@@ -4918,7 +4918,7 @@
             <w:noProof/>
             <w:webHidden/>
           </w:rPr>
-          <w:instrText xml:space="preserve"> PAGEREF _Toc244302295 \h </w:instrText>
+          <w:instrText xml:space="preserve"> PAGEREF _Toc244304554 \h </w:instrText>
         </w:r>
         <w:r>
           <w:rPr>
@@ -4960,7 +4960,7 @@
           <w14:ligatures w14:val="standardContextual"/>
         </w:rPr>
       </w:pPr>
-      <w:hyperlink w:anchor="_Toc244302296" w:history="1">
+      <w:hyperlink w:anchor="_Toc244304555" w:history="1">
         <w:r>
           <w:rPr>
             <w:rStyle w:val="Siuktni"/>
@@ -4987,7 +4987,7 @@
             <w:noProof/>
             <w:webHidden/>
           </w:rPr>
-          <w:instrText xml:space="preserve"> PAGEREF _Toc244302296 \h </w:instrText>
+          <w:instrText xml:space="preserve"> PAGEREF _Toc244304555 \h </w:instrText>
         </w:r>
         <w:r>
           <w:rPr>
@@ -5030,7 +5030,7 @@
           <w14:ligatures w14:val="standardContextual"/>
         </w:rPr>
       </w:pPr>
-      <w:hyperlink w:anchor="_Toc244302297" w:history="1">
+      <w:hyperlink w:anchor="_Toc244304556" w:history="1">
         <w:r>
           <w:rPr>
             <w:rStyle w:val="Siuktni"/>
@@ -5057,7 +5057,7 @@
             <w:noProof/>
             <w:webHidden/>
           </w:rPr>
-          <w:instrText xml:space="preserve"> PAGEREF _Toc244302297 \h </w:instrText>
+          <w:instrText xml:space="preserve"> PAGEREF _Toc244304556 \h </w:instrText>
         </w:r>
         <w:r>
           <w:rPr>
@@ -5099,7 +5099,7 @@
           <w14:ligatures w14:val="standardContextual"/>
         </w:rPr>
       </w:pPr>
-      <w:hyperlink w:anchor="_Toc244302298" w:history="1">
+      <w:hyperlink w:anchor="_Toc244304557" w:history="1">
         <w:r>
           <w:rPr>
             <w:rStyle w:val="Siuktni"/>
@@ -5126,7 +5126,7 @@
             <w:noProof/>
             <w:webHidden/>
           </w:rPr>
-          <w:instrText xml:space="preserve"> PAGEREF _Toc244302298 \h </w:instrText>
+          <w:instrText xml:space="preserve"> PAGEREF _Toc244304557 \h </w:instrText>
         </w:r>
         <w:r>
           <w:rPr>
@@ -5168,7 +5168,7 @@
           <w14:ligatures w14:val="standardContextual"/>
         </w:rPr>
       </w:pPr>
-      <w:hyperlink w:anchor="_Toc244302299" w:history="1">
+      <w:hyperlink w:anchor="_Toc244304558" w:history="1">
         <w:r>
           <w:rPr>
             <w:rStyle w:val="Siuktni"/>
@@ -5195,7 +5195,7 @@
             <w:noProof/>
             <w:webHidden/>
           </w:rPr>
-          <w:instrText xml:space="preserve"> PAGEREF _Toc244302299 \h </w:instrText>
+          <w:instrText xml:space="preserve"> PAGEREF _Toc244304558 \h </w:instrText>
         </w:r>
         <w:r>
           <w:rPr>
@@ -5237,7 +5237,7 @@
           <w14:ligatures w14:val="standardContextual"/>
         </w:rPr>
       </w:pPr>
-      <w:hyperlink w:anchor="_Toc244302300" w:history="1">
+      <w:hyperlink w:anchor="_Toc244304559" w:history="1">
         <w:r>
           <w:rPr>
             <w:rStyle w:val="Siuktni"/>
@@ -5264,7 +5264,7 @@
             <w:noProof/>
             <w:webHidden/>
           </w:rPr>
-          <w:instrText xml:space="preserve"> PAGEREF _Toc244302300 \h </w:instrText>
+          <w:instrText xml:space="preserve"> PAGEREF _Toc244304559 \h </w:instrText>
         </w:r>
         <w:r>
           <w:rPr>
@@ -5306,7 +5306,7 @@
           <w14:ligatures w14:val="standardContextual"/>
         </w:rPr>
       </w:pPr>
-      <w:hyperlink w:anchor="_Toc244302301" w:history="1">
+      <w:hyperlink w:anchor="_Toc244304560" w:history="1">
         <w:r>
           <w:rPr>
             <w:rStyle w:val="Siuktni"/>
@@ -5333,7 +5333,7 @@
             <w:noProof/>
             <w:webHidden/>
           </w:rPr>
-          <w:instrText xml:space="preserve"> PAGEREF _Toc244302301 \h </w:instrText>
+          <w:instrText xml:space="preserve"> PAGEREF _Toc244304560 \h </w:instrText>
         </w:r>
         <w:r>
           <w:rPr>
@@ -5375,7 +5375,7 @@
           <w14:ligatures w14:val="standardContextual"/>
         </w:rPr>
       </w:pPr>
-      <w:hyperlink w:anchor="_Toc244302302" w:history="1">
+      <w:hyperlink w:anchor="_Toc244304561" w:history="1">
         <w:r>
           <w:rPr>
             <w:rStyle w:val="Siuktni"/>
@@ -5402,7 +5402,7 @@
             <w:noProof/>
             <w:webHidden/>
           </w:rPr>
-          <w:instrText xml:space="preserve"> PAGEREF _Toc244302302 \h </w:instrText>
+          <w:instrText xml:space="preserve"> PAGEREF _Toc244304561 \h </w:instrText>
         </w:r>
         <w:r>
           <w:rPr>
@@ -5444,7 +5444,7 @@
           <w14:ligatures w14:val="standardContextual"/>
         </w:rPr>
       </w:pPr>
-      <w:hyperlink w:anchor="_Toc244302303" w:history="1">
+      <w:hyperlink w:anchor="_Toc244304562" w:history="1">
         <w:r>
           <w:rPr>
             <w:rStyle w:val="Siuktni"/>
@@ -5471,7 +5471,7 @@
             <w:noProof/>
             <w:webHidden/>
           </w:rPr>
-          <w:instrText xml:space="preserve"> PAGEREF _Toc244302303 \h </w:instrText>
+          <w:instrText xml:space="preserve"> PAGEREF _Toc244304562 \h </w:instrText>
         </w:r>
         <w:r>
           <w:rPr>
@@ -5513,7 +5513,7 @@
           <w14:ligatures w14:val="standardContextual"/>
         </w:rPr>
       </w:pPr>
-      <w:hyperlink w:anchor="_Toc244302304" w:history="1">
+      <w:hyperlink w:anchor="_Toc244304563" w:history="1">
         <w:r>
           <w:rPr>
             <w:rStyle w:val="Siuktni"/>
@@ -5540,7 +5540,7 @@
             <w:noProof/>
             <w:webHidden/>
           </w:rPr>
-          <w:instrText xml:space="preserve"> PAGEREF _Toc244302304 \h </w:instrText>
+          <w:instrText xml:space="preserve"> PAGEREF _Toc244304563 \h </w:instrText>
         </w:r>
         <w:r>
           <w:rPr>
@@ -5583,7 +5583,7 @@
           <w14:ligatures w14:val="standardContextual"/>
         </w:rPr>
       </w:pPr>
-      <w:hyperlink w:anchor="_Toc244302305" w:history="1">
+      <w:hyperlink w:anchor="_Toc244304564" w:history="1">
         <w:r>
           <w:rPr>
             <w:rStyle w:val="Siuktni"/>
@@ -5610,7 +5610,7 @@
             <w:noProof/>
             <w:webHidden/>
           </w:rPr>
-          <w:instrText xml:space="preserve"> PAGEREF _Toc244302305 \h </w:instrText>
+          <w:instrText xml:space="preserve"> PAGEREF _Toc244304564 \h </w:instrText>
         </w:r>
         <w:r>
           <w:rPr>
@@ -5653,7 +5653,7 @@
           <w14:ligatures w14:val="standardContextual"/>
         </w:rPr>
       </w:pPr>
-      <w:hyperlink w:anchor="_Toc244302306" w:history="1">
+      <w:hyperlink w:anchor="_Toc244304565" w:history="1">
         <w:r>
           <w:rPr>
             <w:rStyle w:val="Siuktni"/>
@@ -5680,7 +5680,7 @@
             <w:noProof/>
             <w:webHidden/>
           </w:rPr>
-          <w:instrText xml:space="preserve"> PAGEREF _Toc244302306 \h </w:instrText>
+          <w:instrText xml:space="preserve"> PAGEREF _Toc244304565 \h </w:instrText>
         </w:r>
         <w:r>
           <w:rPr>
@@ -5723,7 +5723,7 @@
           <w14:ligatures w14:val="standardContextual"/>
         </w:rPr>
       </w:pPr>
-      <w:hyperlink w:anchor="_Toc244302307" w:history="1">
+      <w:hyperlink w:anchor="_Toc244304566" w:history="1">
         <w:r>
           <w:rPr>
             <w:rStyle w:val="Siuktni"/>
@@ -5750,7 +5750,7 @@
             <w:noProof/>
             <w:webHidden/>
           </w:rPr>
-          <w:instrText xml:space="preserve"> PAGEREF _Toc244302307 \h </w:instrText>
+          <w:instrText xml:space="preserve"> PAGEREF _Toc244304566 \h </w:instrText>
         </w:r>
         <w:r>
           <w:rPr>
@@ -5792,7 +5792,7 @@
           <w14:ligatures w14:val="standardContextual"/>
         </w:rPr>
       </w:pPr>
-      <w:hyperlink w:anchor="_Toc244302308" w:history="1">
+      <w:hyperlink w:anchor="_Toc244304567" w:history="1">
         <w:r>
           <w:rPr>
             <w:rStyle w:val="Siuktni"/>
@@ -5819,7 +5819,7 @@
             <w:noProof/>
             <w:webHidden/>
           </w:rPr>
-          <w:instrText xml:space="preserve"> PAGEREF _Toc244302308 \h </w:instrText>
+          <w:instrText xml:space="preserve"> PAGEREF _Toc244304567 \h </w:instrText>
         </w:r>
         <w:r>
           <w:rPr>
@@ -5861,7 +5861,7 @@
           <w14:ligatures w14:val="standardContextual"/>
         </w:rPr>
       </w:pPr>
-      <w:hyperlink w:anchor="_Toc244302309" w:history="1">
+      <w:hyperlink w:anchor="_Toc244304568" w:history="1">
         <w:r>
           <w:rPr>
             <w:rStyle w:val="Siuktni"/>
@@ -5888,7 +5888,7 @@
             <w:noProof/>
             <w:webHidden/>
           </w:rPr>
-          <w:instrText xml:space="preserve"> PAGEREF _Toc244302309 \h </w:instrText>
+          <w:instrText xml:space="preserve"> PAGEREF _Toc244304568 \h </w:instrText>
         </w:r>
         <w:r>
           <w:rPr>
@@ -5931,7 +5931,7 @@
           <w14:ligatures w14:val="standardContextual"/>
         </w:rPr>
       </w:pPr>
-      <w:hyperlink w:anchor="_Toc244302310" w:history="1">
+      <w:hyperlink w:anchor="_Toc244304569" w:history="1">
         <w:r>
           <w:rPr>
             <w:rStyle w:val="Siuktni"/>
@@ -5958,7 +5958,7 @@
             <w:noProof/>
             <w:webHidden/>
           </w:rPr>
-          <w:instrText xml:space="preserve"> PAGEREF _Toc244302310 \h </w:instrText>
+          <w:instrText xml:space="preserve"> PAGEREF _Toc244304569 \h </w:instrText>
         </w:r>
         <w:r>
           <w:rPr>
@@ -6000,7 +6000,7 @@
           <w14:ligatures w14:val="standardContextual"/>
         </w:rPr>
       </w:pPr>
-      <w:hyperlink w:anchor="_Toc244302311" w:history="1">
+      <w:hyperlink w:anchor="_Toc244304570" w:history="1">
         <w:r>
           <w:rPr>
             <w:rStyle w:val="Siuktni"/>
@@ -6027,7 +6027,7 @@
             <w:noProof/>
             <w:webHidden/>
           </w:rPr>
-          <w:instrText xml:space="preserve"> PAGEREF _Toc244302311 \h </w:instrText>
+          <w:instrText xml:space="preserve"> PAGEREF _Toc244304570 \h </w:instrText>
         </w:r>
         <w:r>
           <w:rPr>
@@ -6069,7 +6069,7 @@
           <w14:ligatures w14:val="standardContextual"/>
         </w:rPr>
       </w:pPr>
-      <w:hyperlink w:anchor="_Toc244302312" w:history="1">
+      <w:hyperlink w:anchor="_Toc244304571" w:history="1">
         <w:r>
           <w:rPr>
             <w:rStyle w:val="Siuktni"/>
@@ -6096,7 +6096,7 @@
             <w:noProof/>
             <w:webHidden/>
           </w:rPr>
-          <w:instrText xml:space="preserve"> PAGEREF _Toc244302312 \h </w:instrText>
+          <w:instrText xml:space="preserve"> PAGEREF _Toc244304571 \h </w:instrText>
         </w:r>
         <w:r>
           <w:rPr>
@@ -6139,7 +6139,7 @@
           <w14:ligatures w14:val="standardContextual"/>
         </w:rPr>
       </w:pPr>
-      <w:hyperlink w:anchor="_Toc244302313" w:history="1">
+      <w:hyperlink w:anchor="_Toc244304572" w:history="1">
         <w:r>
           <w:rPr>
             <w:rStyle w:val="Siuktni"/>
@@ -6166,7 +6166,7 @@
             <w:noProof/>
             <w:webHidden/>
           </w:rPr>
-          <w:instrText xml:space="preserve"> PAGEREF _Toc244302313 \h </w:instrText>
+          <w:instrText xml:space="preserve"> PAGEREF _Toc244304572 \h </w:instrText>
         </w:r>
         <w:r>
           <w:rPr>
@@ -6209,7 +6209,7 @@
           <w14:ligatures w14:val="standardContextual"/>
         </w:rPr>
       </w:pPr>
-      <w:hyperlink w:anchor="_Toc244302314" w:history="1">
+      <w:hyperlink w:anchor="_Toc244304573" w:history="1">
         <w:r>
           <w:rPr>
             <w:rStyle w:val="Siuktni"/>
@@ -6236,7 +6236,7 @@
             <w:noProof/>
             <w:webHidden/>
           </w:rPr>
-          <w:instrText xml:space="preserve"> PAGEREF _Toc244302314 \h </w:instrText>
+          <w:instrText xml:space="preserve"> PAGEREF _Toc244304573 \h </w:instrText>
         </w:r>
         <w:r>
           <w:rPr>
@@ -6279,7 +6279,7 @@
           <w14:ligatures w14:val="standardContextual"/>
         </w:rPr>
       </w:pPr>
-      <w:hyperlink w:anchor="_Toc244302315" w:history="1">
+      <w:hyperlink w:anchor="_Toc244304574" w:history="1">
         <w:r>
           <w:rPr>
             <w:rStyle w:val="Siuktni"/>
@@ -6306,7 +6306,7 @@
             <w:noProof/>
             <w:webHidden/>
           </w:rPr>
-          <w:instrText xml:space="preserve"> PAGEREF _Toc244302315 \h </w:instrText>
+          <w:instrText xml:space="preserve"> PAGEREF _Toc244304574 \h </w:instrText>
         </w:r>
         <w:r>
           <w:rPr>
@@ -6360,7 +6360,7 @@
           <w:szCs w:val="26"/>
         </w:rPr>
       </w:pPr>
-      <w:bookmarkStart w:id="0" w:name="_Toc244302249"/>
+      <w:bookmarkStart w:id="0" w:name="_Toc244304508"/>
       <w:r>
         <w:lastRenderedPageBreak/>
         <w:t>LIST OF FIGURES</w:t>
@@ -6390,7 +6390,7 @@
       <w:r>
         <w:fldChar w:fldCharType="separate"/>
       </w:r>
-      <w:hyperlink w:anchor="_Toc244302316" w:history="1">
+      <w:hyperlink w:anchor="_Toc244304575" w:history="1">
         <w:r>
           <w:rPr>
             <w:rStyle w:val="Siuktni"/>
@@ -6417,7 +6417,7 @@
             <w:noProof/>
             <w:webHidden/>
           </w:rPr>
-          <w:instrText xml:space="preserve"> PAGEREF _Toc244302316 \h </w:instrText>
+          <w:instrText xml:space="preserve"> PAGEREF _Toc244304575 \h </w:instrText>
         </w:r>
         <w:r>
           <w:rPr>
@@ -6462,7 +6462,7 @@
           <w14:ligatures w14:val="standardContextual"/>
         </w:rPr>
       </w:pPr>
-      <w:hyperlink w:anchor="_Toc244302317" w:history="1">
+      <w:hyperlink w:anchor="_Toc244304576" w:history="1">
         <w:r>
           <w:rPr>
             <w:rStyle w:val="Siuktni"/>
@@ -6489,7 +6489,7 @@
             <w:noProof/>
             <w:webHidden/>
           </w:rPr>
-          <w:instrText xml:space="preserve"> PAGEREF _Toc244302317 \h </w:instrText>
+          <w:instrText xml:space="preserve"> PAGEREF _Toc244304576 \h </w:instrText>
         </w:r>
         <w:r>
           <w:rPr>
@@ -6534,7 +6534,7 @@
           <w14:ligatures w14:val="standardContextual"/>
         </w:rPr>
       </w:pPr>
-      <w:hyperlink w:anchor="_Toc244302318" w:history="1">
+      <w:hyperlink w:anchor="_Toc244304577" w:history="1">
         <w:r>
           <w:rPr>
             <w:rStyle w:val="Siuktni"/>
@@ -6561,7 +6561,7 @@
             <w:noProof/>
             <w:webHidden/>
           </w:rPr>
-          <w:instrText xml:space="preserve"> PAGEREF _Toc244302318 \h </w:instrText>
+          <w:instrText xml:space="preserve"> PAGEREF _Toc244304577 \h </w:instrText>
         </w:r>
         <w:r>
           <w:rPr>
@@ -6606,7 +6606,7 @@
           <w14:ligatures w14:val="standardContextual"/>
         </w:rPr>
       </w:pPr>
-      <w:hyperlink w:anchor="_Toc244302319" w:history="1">
+      <w:hyperlink w:anchor="_Toc244304578" w:history="1">
         <w:r>
           <w:rPr>
             <w:rStyle w:val="Siuktni"/>
@@ -6633,7 +6633,7 @@
             <w:noProof/>
             <w:webHidden/>
           </w:rPr>
-          <w:instrText xml:space="preserve"> PAGEREF _Toc244302319 \h </w:instrText>
+          <w:instrText xml:space="preserve"> PAGEREF _Toc244304578 \h </w:instrText>
         </w:r>
         <w:r>
           <w:rPr>
@@ -6678,7 +6678,7 @@
           <w14:ligatures w14:val="standardContextual"/>
         </w:rPr>
       </w:pPr>
-      <w:hyperlink w:anchor="_Toc244302320" w:history="1">
+      <w:hyperlink w:anchor="_Toc244304579" w:history="1">
         <w:r>
           <w:rPr>
             <w:rStyle w:val="Siuktni"/>
@@ -6705,7 +6705,7 @@
             <w:noProof/>
             <w:webHidden/>
           </w:rPr>
-          <w:instrText xml:space="preserve"> PAGEREF _Toc244302320 \h </w:instrText>
+          <w:instrText xml:space="preserve"> PAGEREF _Toc244304579 \h </w:instrText>
         </w:r>
         <w:r>
           <w:rPr>
@@ -6750,7 +6750,7 @@
           <w14:ligatures w14:val="standardContextual"/>
         </w:rPr>
       </w:pPr>
-      <w:hyperlink w:anchor="_Toc244302321" w:history="1">
+      <w:hyperlink w:anchor="_Toc244304580" w:history="1">
         <w:r>
           <w:rPr>
             <w:rStyle w:val="Siuktni"/>
@@ -6777,7 +6777,7 @@
             <w:noProof/>
             <w:webHidden/>
           </w:rPr>
-          <w:instrText xml:space="preserve"> PAGEREF _Toc244302321 \h </w:instrText>
+          <w:instrText xml:space="preserve"> PAGEREF _Toc244304580 \h </w:instrText>
         </w:r>
         <w:r>
           <w:rPr>
@@ -6822,7 +6822,7 @@
           <w14:ligatures w14:val="standardContextual"/>
         </w:rPr>
       </w:pPr>
-      <w:hyperlink w:anchor="_Toc244302322" w:history="1">
+      <w:hyperlink w:anchor="_Toc244304581" w:history="1">
         <w:r>
           <w:rPr>
             <w:rStyle w:val="Siuktni"/>
@@ -6849,7 +6849,7 @@
             <w:noProof/>
             <w:webHidden/>
           </w:rPr>
-          <w:instrText xml:space="preserve"> PAGEREF _Toc244302322 \h </w:instrText>
+          <w:instrText xml:space="preserve"> PAGEREF _Toc244304581 \h </w:instrText>
         </w:r>
         <w:r>
           <w:rPr>
@@ -6894,7 +6894,7 @@
           <w14:ligatures w14:val="standardContextual"/>
         </w:rPr>
       </w:pPr>
-      <w:hyperlink w:anchor="_Toc244302323" w:history="1">
+      <w:hyperlink w:anchor="_Toc244304582" w:history="1">
         <w:r>
           <w:rPr>
             <w:rStyle w:val="Siuktni"/>
@@ -6921,7 +6921,7 @@
             <w:noProof/>
             <w:webHidden/>
           </w:rPr>
-          <w:instrText xml:space="preserve"> PAGEREF _Toc244302323 \h </w:instrText>
+          <w:instrText xml:space="preserve"> PAGEREF _Toc244304582 \h </w:instrText>
         </w:r>
         <w:r>
           <w:rPr>
@@ -6966,7 +6966,7 @@
           <w14:ligatures w14:val="standardContextual"/>
         </w:rPr>
       </w:pPr>
-      <w:hyperlink w:anchor="_Toc244302324" w:history="1">
+      <w:hyperlink w:anchor="_Toc244304583" w:history="1">
         <w:r>
           <w:rPr>
             <w:rStyle w:val="Siuktni"/>
@@ -6993,7 +6993,7 @@
             <w:noProof/>
             <w:webHidden/>
           </w:rPr>
-          <w:instrText xml:space="preserve"> PAGEREF _Toc244302324 \h </w:instrText>
+          <w:instrText xml:space="preserve"> PAGEREF _Toc244304583 \h </w:instrText>
         </w:r>
         <w:r>
           <w:rPr>
@@ -7038,7 +7038,7 @@
           <w14:ligatures w14:val="standardContextual"/>
         </w:rPr>
       </w:pPr>
-      <w:hyperlink w:anchor="_Toc244302325" w:history="1">
+      <w:hyperlink w:anchor="_Toc244304584" w:history="1">
         <w:r>
           <w:rPr>
             <w:rStyle w:val="Siuktni"/>
@@ -7065,7 +7065,7 @@
             <w:noProof/>
             <w:webHidden/>
           </w:rPr>
-          <w:instrText xml:space="preserve"> PAGEREF _Toc244302325 \h </w:instrText>
+          <w:instrText xml:space="preserve"> PAGEREF _Toc244304584 \h </w:instrText>
         </w:r>
         <w:r>
           <w:rPr>
@@ -7110,7 +7110,7 @@
           <w14:ligatures w14:val="standardContextual"/>
         </w:rPr>
       </w:pPr>
-      <w:hyperlink w:anchor="_Toc244302326" w:history="1">
+      <w:hyperlink w:anchor="_Toc244304585" w:history="1">
         <w:r>
           <w:rPr>
             <w:rStyle w:val="Siuktni"/>
@@ -7137,7 +7137,7 @@
             <w:noProof/>
             <w:webHidden/>
           </w:rPr>
-          <w:instrText xml:space="preserve"> PAGEREF _Toc244302326 \h </w:instrText>
+          <w:instrText xml:space="preserve"> PAGEREF _Toc244304585 \h </w:instrText>
         </w:r>
         <w:r>
           <w:rPr>
@@ -7182,7 +7182,7 @@
           <w14:ligatures w14:val="standardContextual"/>
         </w:rPr>
       </w:pPr>
-      <w:hyperlink w:anchor="_Toc244302327" w:history="1">
+      <w:hyperlink w:anchor="_Toc244304586" w:history="1">
         <w:r>
           <w:rPr>
             <w:rStyle w:val="Siuktni"/>
@@ -7209,7 +7209,7 @@
             <w:noProof/>
             <w:webHidden/>
           </w:rPr>
-          <w:instrText xml:space="preserve"> PAGEREF _Toc244302327 \h </w:instrText>
+          <w:instrText xml:space="preserve"> PAGEREF _Toc244304586 \h </w:instrText>
         </w:r>
         <w:r>
           <w:rPr>
@@ -7254,7 +7254,7 @@
           <w14:ligatures w14:val="standardContextual"/>
         </w:rPr>
       </w:pPr>
-      <w:hyperlink w:anchor="_Toc244302328" w:history="1">
+      <w:hyperlink w:anchor="_Toc244304587" w:history="1">
         <w:r>
           <w:rPr>
             <w:rStyle w:val="Siuktni"/>
@@ -7281,7 +7281,7 @@
             <w:noProof/>
             <w:webHidden/>
           </w:rPr>
-          <w:instrText xml:space="preserve"> PAGEREF _Toc244302328 \h </w:instrText>
+          <w:instrText xml:space="preserve"> PAGEREF _Toc244304587 \h </w:instrText>
         </w:r>
         <w:r>
           <w:rPr>
@@ -7326,7 +7326,7 @@
           <w14:ligatures w14:val="standardContextual"/>
         </w:rPr>
       </w:pPr>
-      <w:hyperlink w:anchor="_Toc244302329" w:history="1">
+      <w:hyperlink w:anchor="_Toc244304588" w:history="1">
         <w:r>
           <w:rPr>
             <w:rStyle w:val="Siuktni"/>
@@ -7353,7 +7353,7 @@
             <w:noProof/>
             <w:webHidden/>
           </w:rPr>
-          <w:instrText xml:space="preserve"> PAGEREF _Toc244302329 \h </w:instrText>
+          <w:instrText xml:space="preserve"> PAGEREF _Toc244304588 \h </w:instrText>
         </w:r>
         <w:r>
           <w:rPr>
@@ -7398,7 +7398,7 @@
           <w14:ligatures w14:val="standardContextual"/>
         </w:rPr>
       </w:pPr>
-      <w:hyperlink w:anchor="_Toc244302330" w:history="1">
+      <w:hyperlink w:anchor="_Toc244304589" w:history="1">
         <w:r>
           <w:rPr>
             <w:rStyle w:val="Siuktni"/>
@@ -7425,7 +7425,7 @@
             <w:noProof/>
             <w:webHidden/>
           </w:rPr>
-          <w:instrText xml:space="preserve"> PAGEREF _Toc244302330 \h </w:instrText>
+          <w:instrText xml:space="preserve"> PAGEREF _Toc244304589 \h </w:instrText>
         </w:r>
         <w:r>
           <w:rPr>
@@ -7470,7 +7470,7 @@
           <w14:ligatures w14:val="standardContextual"/>
         </w:rPr>
       </w:pPr>
-      <w:hyperlink w:anchor="_Toc244302331" w:history="1">
+      <w:hyperlink w:anchor="_Toc244304590" w:history="1">
         <w:r>
           <w:rPr>
             <w:rStyle w:val="Siuktni"/>
@@ -7497,7 +7497,7 @@
             <w:noProof/>
             <w:webHidden/>
           </w:rPr>
-          <w:instrText xml:space="preserve"> PAGEREF _Toc244302331 \h </w:instrText>
+          <w:instrText xml:space="preserve"> PAGEREF _Toc244304590 \h </w:instrText>
         </w:r>
         <w:r>
           <w:rPr>
@@ -7542,7 +7542,7 @@
           <w14:ligatures w14:val="standardContextual"/>
         </w:rPr>
       </w:pPr>
-      <w:hyperlink w:anchor="_Toc244302332" w:history="1">
+      <w:hyperlink w:anchor="_Toc244304591" w:history="1">
         <w:r>
           <w:rPr>
             <w:rStyle w:val="Siuktni"/>
@@ -7569,7 +7569,7 @@
             <w:noProof/>
             <w:webHidden/>
           </w:rPr>
-          <w:instrText xml:space="preserve"> PAGEREF _Toc244302332 \h </w:instrText>
+          <w:instrText xml:space="preserve"> PAGEREF _Toc244304591 \h </w:instrText>
         </w:r>
         <w:r>
           <w:rPr>
@@ -7614,7 +7614,7 @@
           <w14:ligatures w14:val="standardContextual"/>
         </w:rPr>
       </w:pPr>
-      <w:hyperlink w:anchor="_Toc244302333" w:history="1">
+      <w:hyperlink w:anchor="_Toc244304592" w:history="1">
         <w:r>
           <w:rPr>
             <w:rStyle w:val="Siuktni"/>
@@ -7641,7 +7641,7 @@
             <w:noProof/>
             <w:webHidden/>
           </w:rPr>
-          <w:instrText xml:space="preserve"> PAGEREF _Toc244302333 \h </w:instrText>
+          <w:instrText xml:space="preserve"> PAGEREF _Toc244304592 \h </w:instrText>
         </w:r>
         <w:r>
           <w:rPr>
@@ -7686,7 +7686,7 @@
           <w14:ligatures w14:val="standardContextual"/>
         </w:rPr>
       </w:pPr>
-      <w:hyperlink w:anchor="_Toc244302334" w:history="1">
+      <w:hyperlink w:anchor="_Toc244304593" w:history="1">
         <w:r>
           <w:rPr>
             <w:rStyle w:val="Siuktni"/>
@@ -7713,7 +7713,7 @@
             <w:noProof/>
             <w:webHidden/>
           </w:rPr>
-          <w:instrText xml:space="preserve"> PAGEREF _Toc244302334 \h </w:instrText>
+          <w:instrText xml:space="preserve"> PAGEREF _Toc244304593 \h </w:instrText>
         </w:r>
         <w:r>
           <w:rPr>
@@ -7758,7 +7758,7 @@
           <w14:ligatures w14:val="standardContextual"/>
         </w:rPr>
       </w:pPr>
-      <w:hyperlink w:anchor="_Toc244302335" w:history="1">
+      <w:hyperlink w:anchor="_Toc244304594" w:history="1">
         <w:r>
           <w:rPr>
             <w:rStyle w:val="Siuktni"/>
@@ -7785,7 +7785,7 @@
             <w:noProof/>
             <w:webHidden/>
           </w:rPr>
-          <w:instrText xml:space="preserve"> PAGEREF _Toc244302335 \h </w:instrText>
+          <w:instrText xml:space="preserve"> PAGEREF _Toc244304594 \h </w:instrText>
         </w:r>
         <w:r>
           <w:rPr>
@@ -7830,7 +7830,7 @@
           <w14:ligatures w14:val="standardContextual"/>
         </w:rPr>
       </w:pPr>
-      <w:hyperlink w:anchor="_Toc244302336" w:history="1">
+      <w:hyperlink w:anchor="_Toc244304595" w:history="1">
         <w:r>
           <w:rPr>
             <w:rStyle w:val="Siuktni"/>
@@ -7857,7 +7857,7 @@
             <w:noProof/>
             <w:webHidden/>
           </w:rPr>
-          <w:instrText xml:space="preserve"> PAGEREF _Toc244302336 \h </w:instrText>
+          <w:instrText xml:space="preserve"> PAGEREF _Toc244304595 \h </w:instrText>
         </w:r>
         <w:r>
           <w:rPr>
@@ -7902,7 +7902,7 @@
           <w14:ligatures w14:val="standardContextual"/>
         </w:rPr>
       </w:pPr>
-      <w:hyperlink w:anchor="_Toc244302337" w:history="1">
+      <w:hyperlink w:anchor="_Toc244304596" w:history="1">
         <w:r>
           <w:rPr>
             <w:rStyle w:val="Siuktni"/>
@@ -7929,7 +7929,7 @@
             <w:noProof/>
             <w:webHidden/>
           </w:rPr>
-          <w:instrText xml:space="preserve"> PAGEREF _Toc244302337 \h </w:instrText>
+          <w:instrText xml:space="preserve"> PAGEREF _Toc244304596 \h </w:instrText>
         </w:r>
         <w:r>
           <w:rPr>
@@ -7974,7 +7974,7 @@
           <w14:ligatures w14:val="standardContextual"/>
         </w:rPr>
       </w:pPr>
-      <w:hyperlink w:anchor="_Toc244302338" w:history="1">
+      <w:hyperlink w:anchor="_Toc244304597" w:history="1">
         <w:r>
           <w:rPr>
             <w:rStyle w:val="Siuktni"/>
@@ -8001,7 +8001,7 @@
             <w:noProof/>
             <w:webHidden/>
           </w:rPr>
-          <w:instrText xml:space="preserve"> PAGEREF _Toc244302338 \h </w:instrText>
+          <w:instrText xml:space="preserve"> PAGEREF _Toc244304597 \h </w:instrText>
         </w:r>
         <w:r>
           <w:rPr>
@@ -8046,7 +8046,7 @@
           <w14:ligatures w14:val="standardContextual"/>
         </w:rPr>
       </w:pPr>
-      <w:hyperlink w:anchor="_Toc244302339" w:history="1">
+      <w:hyperlink w:anchor="_Toc244304598" w:history="1">
         <w:r>
           <w:rPr>
             <w:rStyle w:val="Siuktni"/>
@@ -8073,7 +8073,7 @@
             <w:noProof/>
             <w:webHidden/>
           </w:rPr>
-          <w:instrText xml:space="preserve"> PAGEREF _Toc244302339 \h </w:instrText>
+          <w:instrText xml:space="preserve"> PAGEREF _Toc244304598 \h </w:instrText>
         </w:r>
         <w:r>
           <w:rPr>
@@ -8118,7 +8118,7 @@
           <w14:ligatures w14:val="standardContextual"/>
         </w:rPr>
       </w:pPr>
-      <w:hyperlink w:anchor="_Toc244302340" w:history="1">
+      <w:hyperlink w:anchor="_Toc244304599" w:history="1">
         <w:r>
           <w:rPr>
             <w:rStyle w:val="Siuktni"/>
@@ -8145,7 +8145,7 @@
             <w:noProof/>
             <w:webHidden/>
           </w:rPr>
-          <w:instrText xml:space="preserve"> PAGEREF _Toc244302340 \h </w:instrText>
+          <w:instrText xml:space="preserve"> PAGEREF _Toc244304599 \h </w:instrText>
         </w:r>
         <w:r>
           <w:rPr>
@@ -8190,7 +8190,7 @@
           <w14:ligatures w14:val="standardContextual"/>
         </w:rPr>
       </w:pPr>
-      <w:hyperlink w:anchor="_Toc244302341" w:history="1">
+      <w:hyperlink w:anchor="_Toc244304600" w:history="1">
         <w:r>
           <w:rPr>
             <w:rStyle w:val="Siuktni"/>
@@ -8217,7 +8217,7 @@
             <w:noProof/>
             <w:webHidden/>
           </w:rPr>
-          <w:instrText xml:space="preserve"> PAGEREF _Toc244302341 \h </w:instrText>
+          <w:instrText xml:space="preserve"> PAGEREF _Toc244304600 \h </w:instrText>
         </w:r>
         <w:r>
           <w:rPr>
@@ -8262,7 +8262,7 @@
           <w14:ligatures w14:val="standardContextual"/>
         </w:rPr>
       </w:pPr>
-      <w:hyperlink w:anchor="_Toc244302342" w:history="1">
+      <w:hyperlink w:anchor="_Toc244304601" w:history="1">
         <w:r>
           <w:rPr>
             <w:rStyle w:val="Siuktni"/>
@@ -8289,7 +8289,7 @@
             <w:noProof/>
             <w:webHidden/>
           </w:rPr>
-          <w:instrText xml:space="preserve"> PAGEREF _Toc244302342 \h </w:instrText>
+          <w:instrText xml:space="preserve"> PAGEREF _Toc244304601 \h </w:instrText>
         </w:r>
         <w:r>
           <w:rPr>
@@ -8338,7 +8338,7 @@
         </w:numPr>
         <w:jc w:val="center"/>
       </w:pPr>
-      <w:bookmarkStart w:id="1" w:name="_Toc244302250"/>
+      <w:bookmarkStart w:id="1" w:name="_Toc244304509"/>
       <w:r>
         <w:lastRenderedPageBreak/>
         <w:t>LIST OF TABLES</w:t>
@@ -8368,7 +8368,7 @@
       <w:r>
         <w:fldChar w:fldCharType="separate"/>
       </w:r>
-      <w:hyperlink w:anchor="_Toc244302343" w:history="1">
+      <w:hyperlink w:anchor="_Toc244304602" w:history="1">
         <w:r>
           <w:rPr>
             <w:rStyle w:val="Siuktni"/>
@@ -8395,7 +8395,7 @@
             <w:noProof/>
             <w:webHidden/>
           </w:rPr>
-          <w:instrText xml:space="preserve"> PAGEREF _Toc244302343 \h </w:instrText>
+          <w:instrText xml:space="preserve"> PAGEREF _Toc244304602 \h </w:instrText>
         </w:r>
         <w:r>
           <w:rPr>
@@ -8440,7 +8440,7 @@
           <w14:ligatures w14:val="standardContextual"/>
         </w:rPr>
       </w:pPr>
-      <w:hyperlink w:anchor="_Toc244302344" w:history="1">
+      <w:hyperlink w:anchor="_Toc244304603" w:history="1">
         <w:r>
           <w:rPr>
             <w:rStyle w:val="Siuktni"/>
@@ -8467,7 +8467,7 @@
             <w:noProof/>
             <w:webHidden/>
           </w:rPr>
-          <w:instrText xml:space="preserve"> PAGEREF _Toc244302344 \h </w:instrText>
+          <w:instrText xml:space="preserve"> PAGEREF _Toc244304603 \h </w:instrText>
         </w:r>
         <w:r>
           <w:rPr>
@@ -8512,7 +8512,7 @@
           <w14:ligatures w14:val="standardContextual"/>
         </w:rPr>
       </w:pPr>
-      <w:hyperlink w:anchor="_Toc244302345" w:history="1">
+      <w:hyperlink w:anchor="_Toc244304604" w:history="1">
         <w:r>
           <w:rPr>
             <w:rStyle w:val="Siuktni"/>
@@ -8539,7 +8539,7 @@
             <w:noProof/>
             <w:webHidden/>
           </w:rPr>
-          <w:instrText xml:space="preserve"> PAGEREF _Toc244302345 \h </w:instrText>
+          <w:instrText xml:space="preserve"> PAGEREF _Toc244304604 \h </w:instrText>
         </w:r>
         <w:r>
           <w:rPr>
@@ -8584,7 +8584,7 @@
           <w14:ligatures w14:val="standardContextual"/>
         </w:rPr>
       </w:pPr>
-      <w:hyperlink w:anchor="_Toc244302346" w:history="1">
+      <w:hyperlink w:anchor="_Toc244304605" w:history="1">
         <w:r>
           <w:rPr>
             <w:rStyle w:val="Siuktni"/>
@@ -8611,7 +8611,7 @@
             <w:noProof/>
             <w:webHidden/>
           </w:rPr>
-          <w:instrText xml:space="preserve"> PAGEREF _Toc244302346 \h </w:instrText>
+          <w:instrText xml:space="preserve"> PAGEREF _Toc244304605 \h </w:instrText>
         </w:r>
         <w:r>
           <w:rPr>
@@ -8656,7 +8656,7 @@
           <w14:ligatures w14:val="standardContextual"/>
         </w:rPr>
       </w:pPr>
-      <w:hyperlink w:anchor="_Toc244302347" w:history="1">
+      <w:hyperlink w:anchor="_Toc244304606" w:history="1">
         <w:r>
           <w:rPr>
             <w:rStyle w:val="Siuktni"/>
@@ -8683,7 +8683,7 @@
             <w:noProof/>
             <w:webHidden/>
           </w:rPr>
-          <w:instrText xml:space="preserve"> PAGEREF _Toc244302347 \h </w:instrText>
+          <w:instrText xml:space="preserve"> PAGEREF _Toc244304606 \h </w:instrText>
         </w:r>
         <w:r>
           <w:rPr>
@@ -8728,7 +8728,7 @@
           <w14:ligatures w14:val="standardContextual"/>
         </w:rPr>
       </w:pPr>
-      <w:hyperlink w:anchor="_Toc244302348" w:history="1">
+      <w:hyperlink w:anchor="_Toc244304607" w:history="1">
         <w:r>
           <w:rPr>
             <w:rStyle w:val="Siuktni"/>
@@ -8755,7 +8755,7 @@
             <w:noProof/>
             <w:webHidden/>
           </w:rPr>
-          <w:instrText xml:space="preserve"> PAGEREF _Toc244302348 \h </w:instrText>
+          <w:instrText xml:space="preserve"> PAGEREF _Toc244304607 \h </w:instrText>
         </w:r>
         <w:r>
           <w:rPr>
@@ -8800,7 +8800,7 @@
           <w14:ligatures w14:val="standardContextual"/>
         </w:rPr>
       </w:pPr>
-      <w:hyperlink w:anchor="_Toc244302349" w:history="1">
+      <w:hyperlink w:anchor="_Toc244304608" w:history="1">
         <w:r>
           <w:rPr>
             <w:rStyle w:val="Siuktni"/>
@@ -8827,7 +8827,7 @@
             <w:noProof/>
             <w:webHidden/>
           </w:rPr>
-          <w:instrText xml:space="preserve"> PAGEREF _Toc244302349 \h </w:instrText>
+          <w:instrText xml:space="preserve"> PAGEREF _Toc244304608 \h </w:instrText>
         </w:r>
         <w:r>
           <w:rPr>
@@ -8872,7 +8872,7 @@
           <w14:ligatures w14:val="standardContextual"/>
         </w:rPr>
       </w:pPr>
-      <w:hyperlink w:anchor="_Toc244302350" w:history="1">
+      <w:hyperlink w:anchor="_Toc244304609" w:history="1">
         <w:r>
           <w:rPr>
             <w:rStyle w:val="Siuktni"/>
@@ -8899,7 +8899,7 @@
             <w:noProof/>
             <w:webHidden/>
           </w:rPr>
-          <w:instrText xml:space="preserve"> PAGEREF _Toc244302350 \h </w:instrText>
+          <w:instrText xml:space="preserve"> PAGEREF _Toc244304609 \h </w:instrText>
         </w:r>
         <w:r>
           <w:rPr>
@@ -8944,7 +8944,7 @@
           <w14:ligatures w14:val="standardContextual"/>
         </w:rPr>
       </w:pPr>
-      <w:hyperlink w:anchor="_Toc244302351" w:history="1">
+      <w:hyperlink w:anchor="_Toc244304610" w:history="1">
         <w:r>
           <w:rPr>
             <w:rStyle w:val="Siuktni"/>
@@ -8971,7 +8971,7 @@
             <w:noProof/>
             <w:webHidden/>
           </w:rPr>
-          <w:instrText xml:space="preserve"> PAGEREF _Toc244302351 \h </w:instrText>
+          <w:instrText xml:space="preserve"> PAGEREF _Toc244304610 \h </w:instrText>
         </w:r>
         <w:r>
           <w:rPr>
@@ -9016,7 +9016,7 @@
           <w14:ligatures w14:val="standardContextual"/>
         </w:rPr>
       </w:pPr>
-      <w:hyperlink w:anchor="_Toc244302352" w:history="1">
+      <w:hyperlink w:anchor="_Toc244304611" w:history="1">
         <w:r>
           <w:rPr>
             <w:rStyle w:val="Siuktni"/>
@@ -9043,7 +9043,7 @@
             <w:noProof/>
             <w:webHidden/>
           </w:rPr>
-          <w:instrText xml:space="preserve"> PAGEREF _Toc244302352 \h </w:instrText>
+          <w:instrText xml:space="preserve"> PAGEREF _Toc244304611 \h </w:instrText>
         </w:r>
         <w:r>
           <w:rPr>
@@ -9088,7 +9088,7 @@
           <w14:ligatures w14:val="standardContextual"/>
         </w:rPr>
       </w:pPr>
-      <w:hyperlink w:anchor="_Toc244302353" w:history="1">
+      <w:hyperlink w:anchor="_Toc244304612" w:history="1">
         <w:r>
           <w:rPr>
             <w:rStyle w:val="Siuktni"/>
@@ -9115,7 +9115,7 @@
             <w:noProof/>
             <w:webHidden/>
           </w:rPr>
-          <w:instrText xml:space="preserve"> PAGEREF _Toc244302353 \h </w:instrText>
+          <w:instrText xml:space="preserve"> PAGEREF _Toc244304612 \h </w:instrText>
         </w:r>
         <w:r>
           <w:rPr>
@@ -9160,7 +9160,7 @@
           <w14:ligatures w14:val="standardContextual"/>
         </w:rPr>
       </w:pPr>
-      <w:hyperlink w:anchor="_Toc244302354" w:history="1">
+      <w:hyperlink w:anchor="_Toc244304613" w:history="1">
         <w:r>
           <w:rPr>
             <w:rStyle w:val="Siuktni"/>
@@ -9187,7 +9187,7 @@
             <w:noProof/>
             <w:webHidden/>
           </w:rPr>
-          <w:instrText xml:space="preserve"> PAGEREF _Toc244302354 \h </w:instrText>
+          <w:instrText xml:space="preserve"> PAGEREF _Toc244304613 \h </w:instrText>
         </w:r>
         <w:r>
           <w:rPr>
@@ -9232,7 +9232,7 @@
           <w14:ligatures w14:val="standardContextual"/>
         </w:rPr>
       </w:pPr>
-      <w:hyperlink w:anchor="_Toc244302355" w:history="1">
+      <w:hyperlink w:anchor="_Toc244304614" w:history="1">
         <w:r>
           <w:rPr>
             <w:rStyle w:val="Siuktni"/>
@@ -9259,7 +9259,7 @@
             <w:noProof/>
             <w:webHidden/>
           </w:rPr>
-          <w:instrText xml:space="preserve"> PAGEREF _Toc244302355 \h </w:instrText>
+          <w:instrText xml:space="preserve"> PAGEREF _Toc244304614 \h </w:instrText>
         </w:r>
         <w:r>
           <w:rPr>
@@ -9304,7 +9304,7 @@
           <w14:ligatures w14:val="standardContextual"/>
         </w:rPr>
       </w:pPr>
-      <w:hyperlink w:anchor="_Toc244302356" w:history="1">
+      <w:hyperlink w:anchor="_Toc244304615" w:history="1">
         <w:r>
           <w:rPr>
             <w:rStyle w:val="Siuktni"/>
@@ -9331,7 +9331,7 @@
             <w:noProof/>
             <w:webHidden/>
           </w:rPr>
-          <w:instrText xml:space="preserve"> PAGEREF _Toc244302356 \h </w:instrText>
+          <w:instrText xml:space="preserve"> PAGEREF _Toc244304615 \h </w:instrText>
         </w:r>
         <w:r>
           <w:rPr>
@@ -9376,7 +9376,7 @@
           <w14:ligatures w14:val="standardContextual"/>
         </w:rPr>
       </w:pPr>
-      <w:hyperlink w:anchor="_Toc244302357" w:history="1">
+      <w:hyperlink w:anchor="_Toc244304616" w:history="1">
         <w:r>
           <w:rPr>
             <w:rStyle w:val="Siuktni"/>
@@ -9403,7 +9403,7 @@
             <w:noProof/>
             <w:webHidden/>
           </w:rPr>
-          <w:instrText xml:space="preserve"> PAGEREF _Toc244302357 \h </w:instrText>
+          <w:instrText xml:space="preserve"> PAGEREF _Toc244304616 \h </w:instrText>
         </w:r>
         <w:r>
           <w:rPr>
@@ -9448,7 +9448,7 @@
           <w14:ligatures w14:val="standardContextual"/>
         </w:rPr>
       </w:pPr>
-      <w:hyperlink w:anchor="_Toc244302358" w:history="1">
+      <w:hyperlink w:anchor="_Toc244304617" w:history="1">
         <w:r>
           <w:rPr>
             <w:rStyle w:val="Siuktni"/>
@@ -9475,7 +9475,7 @@
             <w:noProof/>
             <w:webHidden/>
           </w:rPr>
-          <w:instrText xml:space="preserve"> PAGEREF _Toc244302358 \h </w:instrText>
+          <w:instrText xml:space="preserve"> PAGEREF _Toc244304617 \h </w:instrText>
         </w:r>
         <w:r>
           <w:rPr>
@@ -9520,7 +9520,7 @@
           <w14:ligatures w14:val="standardContextual"/>
         </w:rPr>
       </w:pPr>
-      <w:hyperlink w:anchor="_Toc244302359" w:history="1">
+      <w:hyperlink w:anchor="_Toc244304618" w:history="1">
         <w:r>
           <w:rPr>
             <w:rStyle w:val="Siuktni"/>
@@ -9547,7 +9547,7 @@
             <w:noProof/>
             <w:webHidden/>
           </w:rPr>
-          <w:instrText xml:space="preserve"> PAGEREF _Toc244302359 \h </w:instrText>
+          <w:instrText xml:space="preserve"> PAGEREF _Toc244304618 \h </w:instrText>
         </w:r>
         <w:r>
           <w:rPr>
@@ -9592,7 +9592,7 @@
           <w14:ligatures w14:val="standardContextual"/>
         </w:rPr>
       </w:pPr>
-      <w:hyperlink w:anchor="_Toc244302360" w:history="1">
+      <w:hyperlink w:anchor="_Toc244304619" w:history="1">
         <w:r>
           <w:rPr>
             <w:rStyle w:val="Siuktni"/>
@@ -9619,7 +9619,7 @@
             <w:noProof/>
             <w:webHidden/>
           </w:rPr>
-          <w:instrText xml:space="preserve"> PAGEREF _Toc244302360 \h </w:instrText>
+          <w:instrText xml:space="preserve"> PAGEREF _Toc244304619 \h </w:instrText>
         </w:r>
         <w:r>
           <w:rPr>
@@ -9664,7 +9664,7 @@
           <w14:ligatures w14:val="standardContextual"/>
         </w:rPr>
       </w:pPr>
-      <w:hyperlink w:anchor="_Toc244302361" w:history="1">
+      <w:hyperlink w:anchor="_Toc244304620" w:history="1">
         <w:r>
           <w:rPr>
             <w:rStyle w:val="Siuktni"/>
@@ -9691,7 +9691,7 @@
             <w:noProof/>
             <w:webHidden/>
           </w:rPr>
-          <w:instrText xml:space="preserve"> PAGEREF _Toc244302361 \h </w:instrText>
+          <w:instrText xml:space="preserve"> PAGEREF _Toc244304620 \h </w:instrText>
         </w:r>
         <w:r>
           <w:rPr>
@@ -9736,7 +9736,7 @@
           <w14:ligatures w14:val="standardContextual"/>
         </w:rPr>
       </w:pPr>
-      <w:hyperlink w:anchor="_Toc244302362" w:history="1">
+      <w:hyperlink w:anchor="_Toc244304621" w:history="1">
         <w:r>
           <w:rPr>
             <w:rStyle w:val="Siuktni"/>
@@ -9763,7 +9763,7 @@
             <w:noProof/>
             <w:webHidden/>
           </w:rPr>
-          <w:instrText xml:space="preserve"> PAGEREF _Toc244302362 \h </w:instrText>
+          <w:instrText xml:space="preserve"> PAGEREF _Toc244304621 \h </w:instrText>
         </w:r>
         <w:r>
           <w:rPr>
@@ -9812,7 +9812,7 @@
         </w:numPr>
         <w:jc w:val="center"/>
       </w:pPr>
-      <w:bookmarkStart w:id="2" w:name="_Toc244302251"/>
+      <w:bookmarkStart w:id="2" w:name="_Toc244304510"/>
       <w:r>
         <w:lastRenderedPageBreak/>
         <w:t>ABBREVIATIONS</w:t>
@@ -10712,7 +10712,7 @@
         <w:pStyle w:val="u1"/>
         <w:keepNext/>
       </w:pPr>
-      <w:bookmarkStart w:id="3" w:name="_Toc244302252"/>
+      <w:bookmarkStart w:id="3" w:name="_Toc244304511"/>
       <w:r>
         <w:lastRenderedPageBreak/>
         <w:t>INTRODUCTION</w:t>
@@ -10724,7 +10724,7 @@
         <w:pStyle w:val="u2"/>
         <w:keepNext/>
       </w:pPr>
-      <w:bookmarkStart w:id="4" w:name="_Toc244302253"/>
+      <w:bookmarkStart w:id="4" w:name="_Toc244304512"/>
       <w:r>
         <w:t>Reasons for choosing the topic</w:t>
       </w:r>
@@ -10762,7 +10762,7 @@
         <w:pStyle w:val="u2"/>
         <w:keepNext/>
       </w:pPr>
-      <w:bookmarkStart w:id="5" w:name="_Toc244302254"/>
+      <w:bookmarkStart w:id="5" w:name="_Toc244304513"/>
       <w:r>
         <w:t>Objectives</w:t>
       </w:r>
@@ -10781,7 +10781,7 @@
         <w:pStyle w:val="u2"/>
         <w:keepNext/>
       </w:pPr>
-      <w:bookmarkStart w:id="6" w:name="_Toc244302255"/>
+      <w:bookmarkStart w:id="6" w:name="_Toc244304514"/>
       <w:r>
         <w:lastRenderedPageBreak/>
         <w:t>Scope and approach</w:t>
@@ -10812,7 +10812,7 @@
         <w:pStyle w:val="u2"/>
         <w:keepNext/>
       </w:pPr>
-      <w:bookmarkStart w:id="7" w:name="_Toc244302256"/>
+      <w:bookmarkStart w:id="7" w:name="_Toc244304515"/>
       <w:r>
         <w:t>Structure of the report</w:t>
       </w:r>
@@ -10832,7 +10832,7 @@
         <w:keepNext/>
         <w:pageBreakBefore/>
       </w:pPr>
-      <w:bookmarkStart w:id="8" w:name="_Toc244302257"/>
+      <w:bookmarkStart w:id="8" w:name="_Toc244304516"/>
       <w:r>
         <w:lastRenderedPageBreak/>
         <w:t>THEORETICAL BASIS</w:t>
@@ -10844,7 +10844,7 @@
         <w:pStyle w:val="u2"/>
         <w:keepNext/>
       </w:pPr>
-      <w:bookmarkStart w:id="9" w:name="_Toc244302258"/>
+      <w:bookmarkStart w:id="9" w:name="_Toc244304517"/>
       <w:r>
         <w:t>A short history of containers</w:t>
       </w:r>
@@ -10880,7 +10880,7 @@
           <w:noProof/>
         </w:rPr>
         <w:drawing>
-          <wp:inline distT="0" distB="0" distL="0" distR="0" wp14:anchorId="089B7506" wp14:editId="4EE511E3">
+          <wp:inline distT="0" distB="0" distL="0" distR="0" wp14:anchorId="248F0A90" wp14:editId="1E95049D">
             <wp:extent cx="5040000" cy="2016000"/>
             <wp:effectExtent l="0" t="0" r="0" b="0"/>
             <wp:docPr id="101" name="Figure 101" descr="Milestones in the history of containers"/>
@@ -10918,7 +10918,7 @@
       <w:pPr>
         <w:pStyle w:val="Chuthich"/>
       </w:pPr>
-      <w:bookmarkStart w:id="10" w:name="_Toc244302316"/>
+      <w:bookmarkStart w:id="10" w:name="_Toc244304575"/>
       <w:r>
         <w:t xml:space="preserve">Figure </w:t>
       </w:r>
@@ -10989,7 +10989,7 @@
         <w:pStyle w:val="u2"/>
         <w:keepNext/>
       </w:pPr>
-      <w:bookmarkStart w:id="11" w:name="_Toc244302259"/>
+      <w:bookmarkStart w:id="11" w:name="_Toc244304518"/>
       <w:r>
         <w:t>Linux foundations</w:t>
       </w:r>
@@ -11008,7 +11008,7 @@
         <w:pStyle w:val="u3"/>
         <w:keepNext/>
       </w:pPr>
-      <w:bookmarkStart w:id="12" w:name="_Toc244302260"/>
+      <w:bookmarkStart w:id="12" w:name="_Toc244304519"/>
       <w:r>
         <w:t>Namespaces</w:t>
       </w:r>
@@ -11027,7 +11027,7 @@
         <w:pStyle w:val="u3"/>
         <w:keepNext/>
       </w:pPr>
-      <w:bookmarkStart w:id="13" w:name="_Toc244302261"/>
+      <w:bookmarkStart w:id="13" w:name="_Toc244304520"/>
       <w:r>
         <w:t>Control groups</w:t>
       </w:r>
@@ -11053,7 +11053,7 @@
         </w:rPr>
         <w:lastRenderedPageBreak/>
         <w:drawing>
-          <wp:inline distT="0" distB="0" distL="0" distR="0" wp14:anchorId="44EC1FD6" wp14:editId="318E1D93">
+          <wp:inline distT="0" distB="0" distL="0" distR="0" wp14:anchorId="55DECDC1" wp14:editId="5F885355">
             <wp:extent cx="5040000" cy="1915200"/>
             <wp:effectExtent l="0" t="0" r="0" b="0"/>
             <wp:docPr id="102" name="Figure 102" descr="Namespaces isolate what a container sees, and cgroups limit what it uses"/>
@@ -11091,7 +11091,7 @@
       <w:pPr>
         <w:pStyle w:val="Chuthich"/>
       </w:pPr>
-      <w:bookmarkStart w:id="14" w:name="_Toc244302317"/>
+      <w:bookmarkStart w:id="14" w:name="_Toc244304576"/>
       <w:r>
         <w:t xml:space="preserve">Figure </w:t>
       </w:r>
@@ -11150,7 +11150,7 @@
         <w:pStyle w:val="u3"/>
         <w:keepNext/>
       </w:pPr>
-      <w:bookmarkStart w:id="15" w:name="_Toc244302262"/>
+      <w:bookmarkStart w:id="15" w:name="_Toc244304521"/>
       <w:r>
         <w:t>Union filesystems and capabilities</w:t>
       </w:r>
@@ -11169,7 +11169,7 @@
         <w:pStyle w:val="u2"/>
         <w:keepNext/>
       </w:pPr>
-      <w:bookmarkStart w:id="16" w:name="_Toc244302263"/>
+      <w:bookmarkStart w:id="16" w:name="_Toc244304522"/>
       <w:r>
         <w:t>Docker architecture</w:t>
       </w:r>
@@ -11198,7 +11198,7 @@
         </w:rPr>
         <w:lastRenderedPageBreak/>
         <w:drawing>
-          <wp:inline distT="0" distB="0" distL="0" distR="0" wp14:anchorId="34115929" wp14:editId="18963BAF">
+          <wp:inline distT="0" distB="0" distL="0" distR="0" wp14:anchorId="0BF1C524" wp14:editId="5524A0B6">
             <wp:extent cx="5040000" cy="2016000"/>
             <wp:effectExtent l="0" t="0" r="0" b="0"/>
             <wp:docPr id="103" name="Figure 103" descr="Components involved in running a container with Docker"/>
@@ -11236,7 +11236,7 @@
       <w:pPr>
         <w:pStyle w:val="Chuthich"/>
       </w:pPr>
-      <w:bookmarkStart w:id="17" w:name="_Toc244302318"/>
+      <w:bookmarkStart w:id="17" w:name="_Toc244304577"/>
       <w:r>
         <w:t xml:space="preserve">Figure </w:t>
       </w:r>
@@ -11303,7 +11303,7 @@
         <w:pStyle w:val="u2"/>
         <w:keepNext/>
       </w:pPr>
-      <w:bookmarkStart w:id="18" w:name="_Toc244302264"/>
+      <w:bookmarkStart w:id="18" w:name="_Toc244304523"/>
       <w:r>
         <w:t>Images, layers and the build cache</w:t>
       </w:r>
@@ -11332,7 +11332,7 @@
         </w:rPr>
         <w:lastRenderedPageBreak/>
         <w:drawing>
-          <wp:inline distT="0" distB="0" distL="0" distR="0" wp14:anchorId="567C6E7B" wp14:editId="7EA75094">
+          <wp:inline distT="0" distB="0" distL="0" distR="0" wp14:anchorId="79364D84" wp14:editId="3348B445">
             <wp:extent cx="4680000" cy="1825200"/>
             <wp:effectExtent l="0" t="0" r="0" b="0"/>
             <wp:docPr id="104" name="Figure 104" descr="An image is a stack of shared read-only layers, and each container adds one writable layer"/>
@@ -11370,7 +11370,7 @@
       <w:pPr>
         <w:pStyle w:val="Chuthich"/>
       </w:pPr>
-      <w:bookmarkStart w:id="19" w:name="_Toc244302319"/>
+      <w:bookmarkStart w:id="19" w:name="_Toc244304578"/>
       <w:r>
         <w:t xml:space="preserve">Figure </w:t>
       </w:r>
@@ -11445,7 +11445,7 @@
         <w:pStyle w:val="u2"/>
         <w:keepNext/>
       </w:pPr>
-      <w:bookmarkStart w:id="20" w:name="_Toc244302265"/>
+      <w:bookmarkStart w:id="20" w:name="_Toc244304524"/>
       <w:r>
         <w:t>Containers at run time</w:t>
       </w:r>
@@ -11471,7 +11471,7 @@
         </w:rPr>
         <w:lastRenderedPageBreak/>
         <w:drawing>
-          <wp:inline distT="0" distB="0" distL="0" distR="0" wp14:anchorId="73CB2D2E" wp14:editId="549141CF">
+          <wp:inline distT="0" distB="0" distL="0" distR="0" wp14:anchorId="07388387" wp14:editId="1E1A77F6">
             <wp:extent cx="5040000" cy="1512000"/>
             <wp:effectExtent l="0" t="0" r="0" b="0"/>
             <wp:docPr id="105" name="Figure 105" descr="Container lifecycle and the path taken by a restart policy"/>
@@ -11509,7 +11509,7 @@
       <w:pPr>
         <w:pStyle w:val="Chuthich"/>
       </w:pPr>
-      <w:bookmarkStart w:id="21" w:name="_Toc244302320"/>
+      <w:bookmarkStart w:id="21" w:name="_Toc244304579"/>
       <w:r>
         <w:t xml:space="preserve">Figure </w:t>
       </w:r>
@@ -11587,7 +11587,7 @@
         <w:pStyle w:val="u2"/>
         <w:keepNext/>
       </w:pPr>
-      <w:bookmarkStart w:id="22" w:name="_Toc244302266"/>
+      <w:bookmarkStart w:id="22" w:name="_Toc244304525"/>
       <w:r>
         <w:t>Networking and storage</w:t>
       </w:r>
@@ -11621,7 +11621,7 @@
         <w:pStyle w:val="u2"/>
         <w:keepNext/>
       </w:pPr>
-      <w:bookmarkStart w:id="23" w:name="_Toc244302267"/>
+      <w:bookmarkStart w:id="23" w:name="_Toc244304526"/>
       <w:r>
         <w:t>Multi-container applications with Docker Compose</w:t>
       </w:r>
@@ -11643,7 +11643,7 @@
         <w:pStyle w:val="u2"/>
         <w:keepNext/>
       </w:pPr>
-      <w:bookmarkStart w:id="24" w:name="_Toc244302268"/>
+      <w:bookmarkStart w:id="24" w:name="_Toc244304527"/>
       <w:r>
         <w:t>Orchestration and scalability</w:t>
       </w:r>
@@ -11669,7 +11669,7 @@
         </w:rPr>
         <w:lastRenderedPageBreak/>
         <w:drawing>
-          <wp:inline distT="0" distB="0" distL="0" distR="0" wp14:anchorId="63968507" wp14:editId="207A4DCA">
+          <wp:inline distT="0" distB="0" distL="0" distR="0" wp14:anchorId="7878C865" wp14:editId="4CACB517">
             <wp:extent cx="4860000" cy="2624400"/>
             <wp:effectExtent l="0" t="0" r="0" b="0"/>
             <wp:docPr id="106" name="Figure 106" descr="Kubernetes architecture. The control plane decides, and the nodes run containers"/>
@@ -11707,7 +11707,7 @@
       <w:pPr>
         <w:pStyle w:val="Chuthich"/>
       </w:pPr>
-      <w:bookmarkStart w:id="25" w:name="_Toc244302321"/>
+      <w:bookmarkStart w:id="25" w:name="_Toc244304580"/>
       <w:r>
         <w:t xml:space="preserve">Figure </w:t>
       </w:r>
@@ -11783,7 +11783,7 @@
           <w:noProof/>
         </w:rPr>
         <w:drawing>
-          <wp:inline distT="0" distB="0" distL="0" distR="0" wp14:anchorId="0F06F59C" wp14:editId="19091021">
+          <wp:inline distT="0" distB="0" distL="0" distR="0" wp14:anchorId="18AC0A80" wp14:editId="1B1B8D7F">
             <wp:extent cx="5040000" cy="1512000"/>
             <wp:effectExtent l="0" t="0" r="0" b="0"/>
             <wp:docPr id="107" name="Figure 107" descr="A rolling update replaces Pods one at a time, keeping capacity constant"/>
@@ -11821,7 +11821,7 @@
       <w:pPr>
         <w:pStyle w:val="Chuthich"/>
       </w:pPr>
-      <w:bookmarkStart w:id="26" w:name="_Toc244302322"/>
+      <w:bookmarkStart w:id="26" w:name="_Toc244304581"/>
       <w:r>
         <w:t xml:space="preserve">Figure </w:t>
       </w:r>
@@ -11892,7 +11892,7 @@
         <w:pStyle w:val="u2"/>
         <w:keepNext/>
       </w:pPr>
-      <w:bookmarkStart w:id="27" w:name="_Toc244302269"/>
+      <w:bookmarkStart w:id="27" w:name="_Toc244304528"/>
       <w:r>
         <w:t>Container security</w:t>
       </w:r>
@@ -11925,7 +11925,7 @@
         <w:pStyle w:val="u2"/>
         <w:keepNext/>
       </w:pPr>
-      <w:bookmarkStart w:id="28" w:name="_Toc244302270"/>
+      <w:bookmarkStart w:id="28" w:name="_Toc244304529"/>
       <w:r>
         <w:t>Advantages and limitations of containers</w:t>
       </w:r>
@@ -11944,7 +11944,7 @@
         <w:pStyle w:val="Chuthich"/>
         <w:keepNext/>
       </w:pPr>
-      <w:bookmarkStart w:id="29" w:name="_Toc244302343"/>
+      <w:bookmarkStart w:id="29" w:name="_Toc244304602"/>
       <w:r>
         <w:lastRenderedPageBreak/>
         <w:t xml:space="preserve">Table </w:t>
@@ -12262,7 +12262,7 @@
         <w:pStyle w:val="u2"/>
         <w:keepNext/>
       </w:pPr>
-      <w:bookmarkStart w:id="30" w:name="_Toc244302271"/>
+      <w:bookmarkStart w:id="30" w:name="_Toc244304530"/>
       <w:r>
         <w:t>Comparative analysis</w:t>
       </w:r>
@@ -12281,7 +12281,7 @@
         <w:pStyle w:val="u3"/>
         <w:keepNext/>
       </w:pPr>
-      <w:bookmarkStart w:id="31" w:name="_Toc244302272"/>
+      <w:bookmarkStart w:id="31" w:name="_Toc244304531"/>
       <w:r>
         <w:t>Containers and virtual machines</w:t>
       </w:r>
@@ -12307,7 +12307,7 @@
         </w:rPr>
         <w:lastRenderedPageBreak/>
         <w:drawing>
-          <wp:inline distT="0" distB="0" distL="0" distR="0" wp14:anchorId="0BBC8D25" wp14:editId="5B7F7F09">
+          <wp:inline distT="0" distB="0" distL="0" distR="0" wp14:anchorId="0B0FEF12" wp14:editId="7D534646">
             <wp:extent cx="4680000" cy="2106000"/>
             <wp:effectExtent l="0" t="0" r="0" b="0"/>
             <wp:docPr id="108" name="Figure 108" descr="Virtual machines carry a full guest operating system, while containers share the host kernel"/>
@@ -12345,7 +12345,7 @@
       <w:pPr>
         <w:pStyle w:val="Chuthich"/>
       </w:pPr>
-      <w:bookmarkStart w:id="32" w:name="_Toc244302323"/>
+      <w:bookmarkStart w:id="32" w:name="_Toc244304582"/>
       <w:r>
         <w:t xml:space="preserve">Figure </w:t>
       </w:r>
@@ -12412,7 +12412,7 @@
         <w:pStyle w:val="Chuthich"/>
         <w:keepNext/>
       </w:pPr>
-      <w:bookmarkStart w:id="33" w:name="_Toc244302344"/>
+      <w:bookmarkStart w:id="33" w:name="_Toc244304603"/>
       <w:r>
         <w:t xml:space="preserve">Table </w:t>
       </w:r>
@@ -12960,7 +12960,7 @@
         <w:pStyle w:val="u3"/>
         <w:keepNext/>
       </w:pPr>
-      <w:bookmarkStart w:id="34" w:name="_Toc244302273"/>
+      <w:bookmarkStart w:id="34" w:name="_Toc244304532"/>
       <w:r>
         <w:t>Docker and other container engines</w:t>
       </w:r>
@@ -12979,7 +12979,7 @@
         <w:pStyle w:val="Chuthich"/>
         <w:keepNext/>
       </w:pPr>
-      <w:bookmarkStart w:id="35" w:name="_Toc244302345"/>
+      <w:bookmarkStart w:id="35" w:name="_Toc244304604"/>
       <w:r>
         <w:t xml:space="preserve">Table </w:t>
       </w:r>
@@ -13494,7 +13494,7 @@
         <w:pStyle w:val="u3"/>
         <w:keepNext/>
       </w:pPr>
-      <w:bookmarkStart w:id="36" w:name="_Toc244302274"/>
+      <w:bookmarkStart w:id="36" w:name="_Toc244304533"/>
       <w:r>
         <w:t>Docker Compose, Swarm, Kubernetes and Nomad</w:t>
       </w:r>
@@ -13513,7 +13513,7 @@
         <w:pStyle w:val="Chuthich"/>
         <w:keepNext/>
       </w:pPr>
-      <w:bookmarkStart w:id="37" w:name="_Toc244302346"/>
+      <w:bookmarkStart w:id="37" w:name="_Toc244304605"/>
       <w:r>
         <w:t xml:space="preserve">Table </w:t>
       </w:r>
@@ -14330,7 +14330,7 @@
         <w:pStyle w:val="u3"/>
         <w:keepNext/>
       </w:pPr>
-      <w:bookmarkStart w:id="38" w:name="_Toc244302275"/>
+      <w:bookmarkStart w:id="38" w:name="_Toc244304534"/>
       <w:r>
         <w:lastRenderedPageBreak/>
         <w:t>Containers and platform services</w:t>
@@ -14354,7 +14354,7 @@
         <w:keepNext/>
         <w:pageBreakBefore/>
       </w:pPr>
-      <w:bookmarkStart w:id="39" w:name="_Toc244302276"/>
+      <w:bookmarkStart w:id="39" w:name="_Toc244304535"/>
       <w:r>
         <w:lastRenderedPageBreak/>
         <w:t>DESIGNING AND IMPLEMENTING</w:t>
@@ -14366,7 +14366,7 @@
         <w:pStyle w:val="u2"/>
         <w:keepNext/>
       </w:pPr>
-      <w:bookmarkStart w:id="40" w:name="_Toc244302277"/>
+      <w:bookmarkStart w:id="40" w:name="_Toc244304536"/>
       <w:r>
         <w:t>Requirement analysis</w:t>
       </w:r>
@@ -14377,7 +14377,7 @@
         <w:pStyle w:val="u3"/>
         <w:keepNext/>
       </w:pPr>
-      <w:bookmarkStart w:id="41" w:name="_Toc244302278"/>
+      <w:bookmarkStart w:id="41" w:name="_Toc244304537"/>
       <w:r>
         <w:t>Purpose and target audience</w:t>
       </w:r>
@@ -14399,7 +14399,7 @@
         <w:pStyle w:val="u3"/>
         <w:keepNext/>
       </w:pPr>
-      <w:bookmarkStart w:id="42" w:name="_Toc244302279"/>
+      <w:bookmarkStart w:id="42" w:name="_Toc244304538"/>
       <w:r>
         <w:t>Functional requirements</w:t>
       </w:r>
@@ -14410,7 +14410,7 @@
         <w:pStyle w:val="Chuthich"/>
         <w:keepNext/>
       </w:pPr>
-      <w:bookmarkStart w:id="43" w:name="_Toc244302347"/>
+      <w:bookmarkStart w:id="43" w:name="_Toc244304606"/>
       <w:r>
         <w:t xml:space="preserve">Table </w:t>
       </w:r>
@@ -14958,7 +14958,7 @@
         <w:pStyle w:val="u3"/>
         <w:keepNext/>
       </w:pPr>
-      <w:bookmarkStart w:id="44" w:name="_Toc244302280"/>
+      <w:bookmarkStart w:id="44" w:name="_Toc244304539"/>
       <w:r>
         <w:t>Non-functional requirements</w:t>
       </w:r>
@@ -14977,7 +14977,7 @@
         <w:pStyle w:val="Chuthich"/>
         <w:keepNext/>
       </w:pPr>
-      <w:bookmarkStart w:id="45" w:name="_Toc244302348"/>
+      <w:bookmarkStart w:id="45" w:name="_Toc244304607"/>
       <w:r>
         <w:lastRenderedPageBreak/>
         <w:t xml:space="preserve">Table </w:t>
@@ -15526,7 +15526,7 @@
         <w:pStyle w:val="u2"/>
         <w:keepNext/>
       </w:pPr>
-      <w:bookmarkStart w:id="46" w:name="_Toc244302281"/>
+      <w:bookmarkStart w:id="46" w:name="_Toc244304540"/>
       <w:r>
         <w:t>System design</w:t>
       </w:r>
@@ -15537,7 +15537,7 @@
         <w:pStyle w:val="u3"/>
         <w:keepNext/>
       </w:pPr>
-      <w:bookmarkStart w:id="47" w:name="_Toc244302282"/>
+      <w:bookmarkStart w:id="47" w:name="_Toc244304541"/>
       <w:r>
         <w:t>System architecture</w:t>
       </w:r>
@@ -15566,7 +15566,7 @@
         </w:rPr>
         <w:lastRenderedPageBreak/>
         <w:drawing>
-          <wp:inline distT="0" distB="0" distL="0" distR="0" wp14:anchorId="453957C2" wp14:editId="43E87F00">
+          <wp:inline distT="0" distB="0" distL="0" distR="0" wp14:anchorId="7EBBE93B" wp14:editId="09EF7BBE">
             <wp:extent cx="5040000" cy="3225600"/>
             <wp:effectExtent l="0" t="0" r="0" b="0"/>
             <wp:docPr id="109" name="Figure 109" descr="DockMart system architecture on Docker Compose"/>
@@ -15604,7 +15604,7 @@
       <w:pPr>
         <w:pStyle w:val="Chuthich"/>
       </w:pPr>
-      <w:bookmarkStart w:id="48" w:name="_Toc244302324"/>
+      <w:bookmarkStart w:id="48" w:name="_Toc244304583"/>
       <w:r>
         <w:t xml:space="preserve">Figure </w:t>
       </w:r>
@@ -15671,7 +15671,7 @@
         <w:pStyle w:val="u3"/>
         <w:keepNext/>
       </w:pPr>
-      <w:bookmarkStart w:id="49" w:name="_Toc244302283"/>
+      <w:bookmarkStart w:id="49" w:name="_Toc244304542"/>
       <w:r>
         <w:t>Data design</w:t>
       </w:r>
@@ -15697,7 +15697,7 @@
         </w:rPr>
         <w:lastRenderedPageBreak/>
         <w:drawing>
-          <wp:inline distT="0" distB="0" distL="0" distR="0" wp14:anchorId="495CEE74" wp14:editId="0D34AE9C">
+          <wp:inline distT="0" distB="0" distL="0" distR="0" wp14:anchorId="436ACC83" wp14:editId="7334A909">
             <wp:extent cx="4860000" cy="2430000"/>
             <wp:effectExtent l="0" t="0" r="0" b="0"/>
             <wp:docPr id="110" name="Figure 110" descr="Entity-relationship diagram of the DockMart database"/>
@@ -15735,7 +15735,7 @@
       <w:pPr>
         <w:pStyle w:val="Chuthich"/>
       </w:pPr>
-      <w:bookmarkStart w:id="50" w:name="_Toc244302325"/>
+      <w:bookmarkStart w:id="50" w:name="_Toc244304584"/>
       <w:r>
         <w:t xml:space="preserve">Figure </w:t>
       </w:r>
@@ -15794,7 +15794,7 @@
         <w:pStyle w:val="u3"/>
         <w:keepNext/>
       </w:pPr>
-      <w:bookmarkStart w:id="51" w:name="_Toc244302284"/>
+      <w:bookmarkStart w:id="51" w:name="_Toc244304543"/>
       <w:r>
         <w:t>Order processing flow</w:t>
       </w:r>
@@ -15823,7 +15823,7 @@
         </w:rPr>
         <w:lastRenderedPageBreak/>
         <w:drawing>
-          <wp:inline distT="0" distB="0" distL="0" distR="0" wp14:anchorId="391B61AD" wp14:editId="6A7EFCDE">
+          <wp:inline distT="0" distB="0" distL="0" distR="0" wp14:anchorId="4645AA3E" wp14:editId="79A0DC9E">
             <wp:extent cx="5040000" cy="3225600"/>
             <wp:effectExtent l="0" t="0" r="0" b="0"/>
             <wp:docPr id="111" name="Figure 111" descr="Sequence of an order, from checkout to the live status update"/>
@@ -15861,7 +15861,7 @@
       <w:pPr>
         <w:pStyle w:val="Chuthich"/>
       </w:pPr>
-      <w:bookmarkStart w:id="52" w:name="_Toc244302326"/>
+      <w:bookmarkStart w:id="52" w:name="_Toc244304585"/>
       <w:r>
         <w:t xml:space="preserve">Figure </w:t>
       </w:r>
@@ -15920,7 +15920,7 @@
         <w:pStyle w:val="u3"/>
         <w:keepNext/>
       </w:pPr>
-      <w:bookmarkStart w:id="53" w:name="_Toc244302285"/>
+      <w:bookmarkStart w:id="53" w:name="_Toc244304544"/>
       <w:r>
         <w:t>Technology choices</w:t>
       </w:r>
@@ -15939,7 +15939,7 @@
         <w:pStyle w:val="Chuthich"/>
         <w:keepNext/>
       </w:pPr>
-      <w:bookmarkStart w:id="54" w:name="_Toc244302349"/>
+      <w:bookmarkStart w:id="54" w:name="_Toc244304608"/>
       <w:r>
         <w:t xml:space="preserve">Table </w:t>
       </w:r>
@@ -16480,7 +16480,7 @@
         <w:pStyle w:val="u2"/>
         <w:keepNext/>
       </w:pPr>
-      <w:bookmarkStart w:id="55" w:name="_Toc244302286"/>
+      <w:bookmarkStart w:id="55" w:name="_Toc244304545"/>
       <w:r>
         <w:t>Implementation</w:t>
       </w:r>
@@ -16491,7 +16491,7 @@
         <w:pStyle w:val="u3"/>
         <w:keepNext/>
       </w:pPr>
-      <w:bookmarkStart w:id="56" w:name="_Toc244302287"/>
+      <w:bookmarkStart w:id="56" w:name="_Toc244304546"/>
       <w:r>
         <w:t>Image design</w:t>
       </w:r>
@@ -16516,7 +16516,7 @@
           <w:noProof/>
         </w:rPr>
         <w:drawing>
-          <wp:inline distT="0" distB="0" distL="0" distR="0" wp14:anchorId="24B7B461" wp14:editId="368FBE03">
+          <wp:inline distT="0" distB="0" distL="0" distR="0" wp14:anchorId="2B3CA045" wp14:editId="4FDD4F1B">
             <wp:extent cx="5040000" cy="2116800"/>
             <wp:effectExtent l="0" t="0" r="0" b="0"/>
             <wp:docPr id="112" name="Figure 112" descr="Multi-stage build of the backend image. Only the production stage ships"/>
@@ -16554,7 +16554,7 @@
       <w:pPr>
         <w:pStyle w:val="Chuthich"/>
       </w:pPr>
-      <w:bookmarkStart w:id="57" w:name="_Toc244302327"/>
+      <w:bookmarkStart w:id="57" w:name="_Toc244304586"/>
       <w:r>
         <w:t xml:space="preserve">Figure </w:t>
       </w:r>
@@ -16859,7 +16859,7 @@
         <w:pStyle w:val="u3"/>
         <w:keepNext/>
       </w:pPr>
-      <w:bookmarkStart w:id="58" w:name="_Toc244302288"/>
+      <w:bookmarkStart w:id="58" w:name="_Toc244304547"/>
       <w:r>
         <w:t>The Compose stack</w:t>
       </w:r>
@@ -16887,7 +16887,7 @@
           <w:noProof/>
         </w:rPr>
         <w:drawing>
-          <wp:inline distT="0" distB="0" distL="0" distR="0" wp14:anchorId="43794B96" wp14:editId="1F5592CF">
+          <wp:inline distT="0" distB="0" distL="0" distR="0" wp14:anchorId="7830A90E" wp14:editId="7DD26DA7">
             <wp:extent cx="4860000" cy="1263600"/>
             <wp:effectExtent l="0" t="0" r="0" b="0"/>
             <wp:docPr id="113" name="Figure 113" descr="Start-up order, driven by health checks instead of fixed delays"/>
@@ -16925,7 +16925,7 @@
       <w:pPr>
         <w:pStyle w:val="Chuthich"/>
       </w:pPr>
-      <w:bookmarkStart w:id="59" w:name="_Toc244302328"/>
+      <w:bookmarkStart w:id="59" w:name="_Toc244304587"/>
       <w:r>
         <w:t xml:space="preserve">Figure </w:t>
       </w:r>
@@ -16995,7 +16995,7 @@
         <w:pStyle w:val="u3"/>
         <w:keepNext/>
       </w:pPr>
-      <w:bookmarkStart w:id="60" w:name="_Toc244302289"/>
+      <w:bookmarkStart w:id="60" w:name="_Toc244304548"/>
       <w:r>
         <w:lastRenderedPageBreak/>
         <w:t>Dynamic load balancing</w:t>
@@ -17031,7 +17031,7 @@
         <w:pStyle w:val="u3"/>
         <w:keepNext/>
       </w:pPr>
-      <w:bookmarkStart w:id="61" w:name="_Toc244302290"/>
+      <w:bookmarkStart w:id="61" w:name="_Toc244304549"/>
       <w:r>
         <w:t>Stateless replicas</w:t>
       </w:r>
@@ -17050,7 +17050,7 @@
         <w:pStyle w:val="Chuthich"/>
         <w:keepNext/>
       </w:pPr>
-      <w:bookmarkStart w:id="62" w:name="_Toc244302350"/>
+      <w:bookmarkStart w:id="62" w:name="_Toc244304609"/>
       <w:r>
         <w:lastRenderedPageBreak/>
         <w:t xml:space="preserve">Table </w:t>
@@ -17473,7 +17473,7 @@
           <w:noProof/>
         </w:rPr>
         <w:drawing>
-          <wp:inline distT="0" distB="0" distL="0" distR="0" wp14:anchorId="30EDD675" wp14:editId="2F491661">
+          <wp:inline distT="0" distB="0" distL="0" distR="0" wp14:anchorId="0CC58B58" wp14:editId="117F6332">
             <wp:extent cx="4860000" cy="1215000"/>
             <wp:effectExtent l="0" t="0" r="0" b="0"/>
             <wp:docPr id="114" name="Figure 114" descr="How the Ops Center discovers replicas without access to the Docker socket"/>
@@ -17511,7 +17511,7 @@
       <w:pPr>
         <w:pStyle w:val="Chuthich"/>
       </w:pPr>
-      <w:bookmarkStart w:id="63" w:name="_Toc244302329"/>
+      <w:bookmarkStart w:id="63" w:name="_Toc244304588"/>
       <w:r>
         <w:t xml:space="preserve">Figure </w:t>
       </w:r>
@@ -17570,7 +17570,7 @@
         <w:pStyle w:val="u3"/>
         <w:keepNext/>
       </w:pPr>
-      <w:bookmarkStart w:id="64" w:name="_Toc244302291"/>
+      <w:bookmarkStart w:id="64" w:name="_Toc244304550"/>
       <w:r>
         <w:t>Reliability</w:t>
       </w:r>
@@ -17609,7 +17609,7 @@
         <w:pStyle w:val="u3"/>
         <w:keepNext/>
       </w:pPr>
-      <w:bookmarkStart w:id="65" w:name="_Toc244302292"/>
+      <w:bookmarkStart w:id="65" w:name="_Toc244304551"/>
       <w:r>
         <w:t>Security hardening</w:t>
       </w:r>
@@ -17628,7 +17628,7 @@
         <w:pStyle w:val="Chuthich"/>
         <w:keepNext/>
       </w:pPr>
-      <w:bookmarkStart w:id="66" w:name="_Toc244302351"/>
+      <w:bookmarkStart w:id="66" w:name="_Toc244304610"/>
       <w:r>
         <w:t xml:space="preserve">Table </w:t>
       </w:r>
@@ -18169,7 +18169,7 @@
         <w:pStyle w:val="u3"/>
         <w:keepNext/>
       </w:pPr>
-      <w:bookmarkStart w:id="67" w:name="_Toc244302293"/>
+      <w:bookmarkStart w:id="67" w:name="_Toc244304552"/>
       <w:r>
         <w:t>Monitoring</w:t>
       </w:r>
@@ -18188,7 +18188,7 @@
         <w:pStyle w:val="u3"/>
         <w:keepNext/>
       </w:pPr>
-      <w:bookmarkStart w:id="68" w:name="_Toc244302294"/>
+      <w:bookmarkStart w:id="68" w:name="_Toc244304553"/>
       <w:r>
         <w:t>Kubernetes deployment</w:t>
       </w:r>
@@ -18207,7 +18207,7 @@
         <w:pStyle w:val="Chuthich"/>
         <w:keepNext/>
       </w:pPr>
-      <w:bookmarkStart w:id="69" w:name="_Toc244302352"/>
+      <w:bookmarkStart w:id="69" w:name="_Toc244304611"/>
       <w:r>
         <w:t xml:space="preserve">Table </w:t>
       </w:r>
@@ -18711,7 +18711,7 @@
         <w:pStyle w:val="u3"/>
         <w:keepNext/>
       </w:pPr>
-      <w:bookmarkStart w:id="70" w:name="_Toc244302295"/>
+      <w:bookmarkStart w:id="70" w:name="_Toc244304554"/>
       <w:r>
         <w:t>Development workflow and delivery</w:t>
       </w:r>
@@ -18736,7 +18736,7 @@
           <w:noProof/>
         </w:rPr>
         <w:drawing>
-          <wp:inline distT="0" distB="0" distL="0" distR="0" wp14:anchorId="21EC52D8" wp14:editId="0232E683">
+          <wp:inline distT="0" distB="0" distL="0" distR="0" wp14:anchorId="5F0D3FCB" wp14:editId="1A55254A">
             <wp:extent cx="5040000" cy="907200"/>
             <wp:effectExtent l="0" t="0" r="0" b="0"/>
             <wp:docPr id="115" name="Figure 115" descr="Delivery pipeline defined in the GitHub Actions workflow"/>
@@ -18774,7 +18774,7 @@
       <w:pPr>
         <w:pStyle w:val="Chuthich"/>
       </w:pPr>
-      <w:bookmarkStart w:id="71" w:name="_Toc244302330"/>
+      <w:bookmarkStart w:id="71" w:name="_Toc244304589"/>
       <w:r>
         <w:t xml:space="preserve">Figure </w:t>
       </w:r>
@@ -18834,7 +18834,7 @@
       </w:pPr>
       <w:r>
         <w:lastRenderedPageBreak/>
-        <w:t>The repository also contains a GitHub Actions pipeline, shown in Figure 3.7. We did not execute it because the project was not hosted on GitHub, but each step in it was run by hand during the project.</w:t>
+        <w:t>The repository also contains a GitHub Actions pipeline, shown in Figure 3.7. We have not executed the pipeline itself, but each step in it was run by hand during the project.</w:t>
       </w:r>
     </w:p>
     <w:p>
@@ -18842,7 +18842,7 @@
         <w:pStyle w:val="u2"/>
         <w:keepNext/>
       </w:pPr>
-      <w:bookmarkStart w:id="72" w:name="_Toc244302296"/>
+      <w:bookmarkStart w:id="72" w:name="_Toc244304555"/>
       <w:r>
         <w:t>Website walkthrough</w:t>
       </w:r>
@@ -18867,7 +18867,7 @@
           <w:noProof/>
         </w:rPr>
         <w:drawing>
-          <wp:inline distT="0" distB="0" distL="0" distR="0" wp14:anchorId="75C1F259" wp14:editId="2C7B3A78">
+          <wp:inline distT="0" distB="0" distL="0" distR="0" wp14:anchorId="4F8459DB" wp14:editId="2377F576">
             <wp:extent cx="3960000" cy="2475000"/>
             <wp:effectExtent l="0" t="0" r="0" b="0"/>
             <wp:docPr id="116" name="Figure 116" descr="Storefront, with the cache status and the replica that served the page"/>
@@ -18905,7 +18905,7 @@
       <w:pPr>
         <w:pStyle w:val="Chuthich"/>
       </w:pPr>
-      <w:bookmarkStart w:id="73" w:name="_Toc244302331"/>
+      <w:bookmarkStart w:id="73" w:name="_Toc244304590"/>
       <w:r>
         <w:t xml:space="preserve">Figure </w:t>
       </w:r>
@@ -18979,7 +18979,7 @@
         </w:rPr>
         <w:lastRenderedPageBreak/>
         <w:drawing>
-          <wp:inline distT="0" distB="0" distL="0" distR="0" wp14:anchorId="0E7EDAFF" wp14:editId="33A43477">
+          <wp:inline distT="0" distB="0" distL="0" distR="0" wp14:anchorId="4C106D9C" wp14:editId="2D49C6ED">
             <wp:extent cx="3960000" cy="2475000"/>
             <wp:effectExtent l="0" t="0" r="0" b="0"/>
             <wp:docPr id="117" name="Figure 117" descr="Live order tracking, updated through Server-Sent Events"/>
@@ -19017,7 +19017,7 @@
       <w:pPr>
         <w:pStyle w:val="Chuthich"/>
       </w:pPr>
-      <w:bookmarkStart w:id="74" w:name="_Toc244302332"/>
+      <w:bookmarkStart w:id="74" w:name="_Toc244304591"/>
       <w:r>
         <w:t xml:space="preserve">Figure </w:t>
       </w:r>
@@ -19091,7 +19091,7 @@
         </w:rPr>
         <w:lastRenderedPageBreak/>
         <w:drawing>
-          <wp:inline distT="0" distB="0" distL="0" distR="0" wp14:anchorId="3D7D8C2D" wp14:editId="1477771D">
+          <wp:inline distT="0" distB="0" distL="0" distR="0" wp14:anchorId="02612FFE" wp14:editId="657AD819">
             <wp:extent cx="3420000" cy="3371906"/>
             <wp:effectExtent l="0" t="0" r="0" b="0"/>
             <wp:docPr id="118" name="Figure 118" descr="Ops Center just after one replica crashed: its uptime was reset, its restart count rose, and the event log recorded the crash"/>
@@ -19129,7 +19129,7 @@
       <w:pPr>
         <w:pStyle w:val="Chuthich"/>
       </w:pPr>
-      <w:bookmarkStart w:id="75" w:name="_Toc244302333"/>
+      <w:bookmarkStart w:id="75" w:name="_Toc244304592"/>
       <w:r>
         <w:t xml:space="preserve">Figure </w:t>
       </w:r>
@@ -19202,7 +19202,7 @@
           <w:noProof/>
         </w:rPr>
         <w:drawing>
-          <wp:inline distT="0" distB="0" distL="0" distR="0" wp14:anchorId="46214211" wp14:editId="04F0584D">
+          <wp:inline distT="0" distB="0" distL="0" distR="0" wp14:anchorId="34C11319" wp14:editId="6E0672A8">
             <wp:extent cx="4320000" cy="2700000"/>
             <wp:effectExtent l="0" t="0" r="0" b="0"/>
             <wp:docPr id="119" name="Figure 119" descr="Grafana dashboard, with replicas discovered automatically by Prometheus"/>
@@ -19240,7 +19240,7 @@
       <w:pPr>
         <w:pStyle w:val="Chuthich"/>
       </w:pPr>
-      <w:bookmarkStart w:id="76" w:name="_Toc244302334"/>
+      <w:bookmarkStart w:id="76" w:name="_Toc244304593"/>
       <w:r>
         <w:t xml:space="preserve">Figure </w:t>
       </w:r>
@@ -19300,7 +19300,7 @@
         <w:keepNext/>
         <w:pageBreakBefore/>
       </w:pPr>
-      <w:bookmarkStart w:id="77" w:name="_Toc244302297"/>
+      <w:bookmarkStart w:id="77" w:name="_Toc244304556"/>
       <w:r>
         <w:lastRenderedPageBreak/>
         <w:t>RESULT</w:t>
@@ -19312,7 +19312,7 @@
         <w:pStyle w:val="u2"/>
         <w:keepNext/>
       </w:pPr>
-      <w:bookmarkStart w:id="78" w:name="_Toc244302298"/>
+      <w:bookmarkStart w:id="78" w:name="_Toc244304557"/>
       <w:r>
         <w:t>Test environment and method</w:t>
       </w:r>
@@ -19334,7 +19334,7 @@
         <w:pStyle w:val="Chuthich"/>
         <w:keepNext/>
       </w:pPr>
-      <w:bookmarkStart w:id="79" w:name="_Toc244302353"/>
+      <w:bookmarkStart w:id="79" w:name="_Toc244304612"/>
       <w:r>
         <w:t xml:space="preserve">Table </w:t>
       </w:r>
@@ -19683,7 +19683,7 @@
         <w:pStyle w:val="u2"/>
         <w:keepNext/>
       </w:pPr>
-      <w:bookmarkStart w:id="80" w:name="_Toc244302299"/>
+      <w:bookmarkStart w:id="80" w:name="_Toc244304558"/>
       <w:r>
         <w:t>Functional testing</w:t>
       </w:r>
@@ -19705,7 +19705,7 @@
         <w:pStyle w:val="Chuthich"/>
         <w:keepNext/>
       </w:pPr>
-      <w:bookmarkStart w:id="81" w:name="_Toc244302354"/>
+      <w:bookmarkStart w:id="81" w:name="_Toc244304613"/>
       <w:r>
         <w:lastRenderedPageBreak/>
         <w:t xml:space="preserve">Table </w:t>
@@ -20153,7 +20153,7 @@
           <w:noProof/>
         </w:rPr>
         <w:drawing>
-          <wp:inline distT="0" distB="0" distL="0" distR="0" wp14:anchorId="13783873" wp14:editId="061A4948">
+          <wp:inline distT="0" distB="0" distL="0" distR="0" wp14:anchorId="0869894D" wp14:editId="53C50299">
             <wp:extent cx="4500000" cy="1982065"/>
             <wp:effectExtent l="0" t="0" r="0" b="0"/>
             <wp:docPr id="120" name="Figure 120" descr="All services running and healthy on Docker Compose (real output)"/>
@@ -20191,7 +20191,7 @@
       <w:pPr>
         <w:pStyle w:val="Chuthich"/>
       </w:pPr>
-      <w:bookmarkStart w:id="82" w:name="_Toc244302335"/>
+      <w:bookmarkStart w:id="82" w:name="_Toc244304594"/>
       <w:r>
         <w:t xml:space="preserve">Figure </w:t>
       </w:r>
@@ -20250,7 +20250,7 @@
         <w:pStyle w:val="u2"/>
         <w:keepNext/>
       </w:pPr>
-      <w:bookmarkStart w:id="83" w:name="_Toc244302300"/>
+      <w:bookmarkStart w:id="83" w:name="_Toc244304559"/>
       <w:r>
         <w:t>Image build strategies</w:t>
       </w:r>
@@ -20279,7 +20279,7 @@
         </w:rPr>
         <w:lastRenderedPageBreak/>
         <w:drawing>
-          <wp:inline distT="0" distB="0" distL="0" distR="0" wp14:anchorId="3979F6CB" wp14:editId="16FDA6F6">
+          <wp:inline distT="0" distB="0" distL="0" distR="0" wp14:anchorId="48018731" wp14:editId="7DAC33F2">
             <wp:extent cx="4500000" cy="1703821"/>
             <wp:effectExtent l="0" t="0" r="0" b="0"/>
             <wp:docPr id="121" name="Figure 121" descr="Size of the same application under four build strategies"/>
@@ -20317,7 +20317,7 @@
       <w:pPr>
         <w:pStyle w:val="Chuthich"/>
       </w:pPr>
-      <w:bookmarkStart w:id="84" w:name="_Toc244302336"/>
+      <w:bookmarkStart w:id="84" w:name="_Toc244304595"/>
       <w:r>
         <w:t xml:space="preserve">Figure </w:t>
       </w:r>
@@ -20376,7 +20376,7 @@
         <w:pStyle w:val="Chuthich"/>
         <w:keepNext/>
       </w:pPr>
-      <w:bookmarkStart w:id="85" w:name="_Toc244302355"/>
+      <w:bookmarkStart w:id="85" w:name="_Toc244304614"/>
       <w:r>
         <w:t xml:space="preserve">Table </w:t>
       </w:r>
@@ -21366,7 +21366,7 @@
           <w:noProof/>
         </w:rPr>
         <w:drawing>
-          <wp:inline distT="0" distB="0" distL="0" distR="0" wp14:anchorId="1BFADD59" wp14:editId="020A58BB">
+          <wp:inline distT="0" distB="0" distL="0" distR="0" wp14:anchorId="5251C040" wp14:editId="25494279">
             <wp:extent cx="4500000" cy="1843200"/>
             <wp:effectExtent l="0" t="0" r="0" b="0"/>
             <wp:docPr id="122" name="Figure 122" descr="Build time, first build and rebuild after a one-line change"/>
@@ -21404,7 +21404,7 @@
       <w:pPr>
         <w:pStyle w:val="Chuthich"/>
       </w:pPr>
-      <w:bookmarkStart w:id="86" w:name="_Toc244302337"/>
+      <w:bookmarkStart w:id="86" w:name="_Toc244304596"/>
       <w:r>
         <w:t xml:space="preserve">Figure </w:t>
       </w:r>
@@ -21463,7 +21463,7 @@
         <w:pStyle w:val="u2"/>
         <w:keepNext/>
       </w:pPr>
-      <w:bookmarkStart w:id="87" w:name="_Toc244302301"/>
+      <w:bookmarkStart w:id="87" w:name="_Toc244304560"/>
       <w:r>
         <w:t>Start-up time and resource usage</w:t>
       </w:r>
@@ -21492,7 +21492,7 @@
         </w:rPr>
         <w:lastRenderedPageBreak/>
         <w:drawing>
-          <wp:inline distT="0" distB="0" distL="0" distR="0" wp14:anchorId="61FAB6A7" wp14:editId="6A3E11C3">
+          <wp:inline distT="0" distB="0" distL="0" distR="0" wp14:anchorId="0687F307" wp14:editId="28830991">
             <wp:extent cx="4320000" cy="1574487"/>
             <wp:effectExtent l="0" t="0" r="0" b="0"/>
             <wp:docPr id="123" name="Figure 123" descr="Memory used by each container at idle"/>
@@ -21530,7 +21530,7 @@
       <w:pPr>
         <w:pStyle w:val="Chuthich"/>
       </w:pPr>
-      <w:bookmarkStart w:id="88" w:name="_Toc244302338"/>
+      <w:bookmarkStart w:id="88" w:name="_Toc244304597"/>
       <w:r>
         <w:t xml:space="preserve">Figure </w:t>
       </w:r>
@@ -21589,7 +21589,7 @@
         <w:pStyle w:val="u2"/>
         <w:keepNext/>
       </w:pPr>
-      <w:bookmarkStart w:id="89" w:name="_Toc244302302"/>
+      <w:bookmarkStart w:id="89" w:name="_Toc244304561"/>
       <w:r>
         <w:t>Horizontal scaling</w:t>
       </w:r>
@@ -21617,7 +21617,7 @@
           <w:noProof/>
         </w:rPr>
         <w:drawing>
-          <wp:inline distT="0" distB="0" distL="0" distR="0" wp14:anchorId="6A3C68AA" wp14:editId="2A882125">
+          <wp:inline distT="0" distB="0" distL="0" distR="0" wp14:anchorId="4612D817" wp14:editId="5BF8D115">
             <wp:extent cx="4680000" cy="2343817"/>
             <wp:effectExtent l="0" t="0" r="0" b="0"/>
             <wp:docPr id="124" name="Figure 124" descr="Throughput and latency as replicas are added"/>
@@ -21655,7 +21655,7 @@
       <w:pPr>
         <w:pStyle w:val="Chuthich"/>
       </w:pPr>
-      <w:bookmarkStart w:id="90" w:name="_Toc244302339"/>
+      <w:bookmarkStart w:id="90" w:name="_Toc244304598"/>
       <w:r>
         <w:t xml:space="preserve">Figure </w:t>
       </w:r>
@@ -21714,7 +21714,7 @@
         <w:pStyle w:val="Chuthich"/>
         <w:keepNext/>
       </w:pPr>
-      <w:bookmarkStart w:id="91" w:name="_Toc244302356"/>
+      <w:bookmarkStart w:id="91" w:name="_Toc244304615"/>
       <w:r>
         <w:lastRenderedPageBreak/>
         <w:t xml:space="preserve">Table </w:t>
@@ -22426,7 +22426,7 @@
         <w:pStyle w:val="u2"/>
         <w:keepNext/>
       </w:pPr>
-      <w:bookmarkStart w:id="92" w:name="_Toc244302303"/>
+      <w:bookmarkStart w:id="92" w:name="_Toc244304562"/>
       <w:r>
         <w:t>Failure behaviour on Docker Compose</w:t>
       </w:r>
@@ -22445,7 +22445,7 @@
         <w:pStyle w:val="Chuthich"/>
         <w:keepNext/>
       </w:pPr>
-      <w:bookmarkStart w:id="93" w:name="_Toc244302357"/>
+      <w:bookmarkStart w:id="93" w:name="_Toc244304616"/>
       <w:r>
         <w:t xml:space="preserve">Table </w:t>
       </w:r>
@@ -22837,7 +22837,7 @@
         <w:pStyle w:val="Chuthich"/>
         <w:keepNext/>
       </w:pPr>
-      <w:bookmarkStart w:id="94" w:name="_Toc244302358"/>
+      <w:bookmarkStart w:id="94" w:name="_Toc244304617"/>
       <w:r>
         <w:lastRenderedPageBreak/>
         <w:t xml:space="preserve">Table </w:t>
@@ -23657,7 +23657,7 @@
         <w:pStyle w:val="u2"/>
         <w:keepNext/>
       </w:pPr>
-      <w:bookmarkStart w:id="95" w:name="_Toc244302304"/>
+      <w:bookmarkStart w:id="95" w:name="_Toc244304563"/>
       <w:r>
         <w:t>Kubernetes</w:t>
       </w:r>
@@ -23668,7 +23668,7 @@
         <w:pStyle w:val="u3"/>
         <w:keepNext/>
       </w:pPr>
-      <w:bookmarkStart w:id="96" w:name="_Toc244302305"/>
+      <w:bookmarkStart w:id="96" w:name="_Toc244304564"/>
       <w:r>
         <w:t>Availability</w:t>
       </w:r>
@@ -23696,7 +23696,7 @@
           <w:noProof/>
         </w:rPr>
         <w:drawing>
-          <wp:inline distT="0" distB="0" distL="0" distR="0" wp14:anchorId="436C44AF" wp14:editId="2B93C8EA">
+          <wp:inline distT="0" distB="0" distL="0" distR="0" wp14:anchorId="7379ED97" wp14:editId="279CA754">
             <wp:extent cx="4320000" cy="2053138"/>
             <wp:effectExtent l="0" t="0" r="0" b="0"/>
             <wp:docPr id="125" name="Figure 125" descr="Ready Pods by version during a rolling update"/>
@@ -23734,7 +23734,7 @@
       <w:pPr>
         <w:pStyle w:val="Chuthich"/>
       </w:pPr>
-      <w:bookmarkStart w:id="97" w:name="_Toc244302340"/>
+      <w:bookmarkStart w:id="97" w:name="_Toc244304599"/>
       <w:r>
         <w:t xml:space="preserve">Figure </w:t>
       </w:r>
@@ -23793,7 +23793,7 @@
         <w:pStyle w:val="Chuthich"/>
         <w:keepNext/>
       </w:pPr>
-      <w:bookmarkStart w:id="98" w:name="_Toc244302359"/>
+      <w:bookmarkStart w:id="98" w:name="_Toc244304618"/>
       <w:r>
         <w:lastRenderedPageBreak/>
         <w:t xml:space="preserve">Table </w:t>
@@ -24313,7 +24313,7 @@
           <w:noProof/>
         </w:rPr>
         <w:drawing>
-          <wp:inline distT="0" distB="0" distL="0" distR="0" wp14:anchorId="5F8F7C97" wp14:editId="1EABA6EA">
+          <wp:inline distT="0" distB="0" distL="0" distR="0" wp14:anchorId="3FCC0387" wp14:editId="10B02CDC">
             <wp:extent cx="4140000" cy="1922813"/>
             <wp:effectExtent l="0" t="0" r="0" b="0"/>
             <wp:docPr id="126" name="Figure 126" descr="DockMart Pods spread across the two worker nodes of the cluster (real output)"/>
@@ -24351,7 +24351,7 @@
       <w:pPr>
         <w:pStyle w:val="Chuthich"/>
       </w:pPr>
-      <w:bookmarkStart w:id="99" w:name="_Toc244302341"/>
+      <w:bookmarkStart w:id="99" w:name="_Toc244304600"/>
       <w:r>
         <w:t xml:space="preserve">Figure </w:t>
       </w:r>
@@ -24421,7 +24421,7 @@
         <w:pStyle w:val="u3"/>
         <w:keepNext/>
       </w:pPr>
-      <w:bookmarkStart w:id="100" w:name="_Toc244302306"/>
+      <w:bookmarkStart w:id="100" w:name="_Toc244304565"/>
       <w:r>
         <w:t>Autoscaling</w:t>
       </w:r>
@@ -24450,7 +24450,7 @@
           <w:noProof/>
         </w:rPr>
         <w:drawing>
-          <wp:inline distT="0" distB="0" distL="0" distR="0" wp14:anchorId="3A2F34BA" wp14:editId="4006959E">
+          <wp:inline distT="0" distB="0" distL="0" distR="0" wp14:anchorId="51B5AD17" wp14:editId="41BE3BE6">
             <wp:extent cx="4140000" cy="2669597"/>
             <wp:effectExtent l="0" t="0" r="0" b="0"/>
             <wp:docPr id="127" name="Figure 127" descr="Autoscaling under load: replicas and average CPU use"/>
@@ -24488,7 +24488,7 @@
       <w:pPr>
         <w:pStyle w:val="Chuthich"/>
       </w:pPr>
-      <w:bookmarkStart w:id="101" w:name="_Toc244302342"/>
+      <w:bookmarkStart w:id="101" w:name="_Toc244304601"/>
       <w:r>
         <w:t xml:space="preserve">Figure </w:t>
       </w:r>
@@ -24547,7 +24547,7 @@
         <w:pStyle w:val="u3"/>
         <w:keepNext/>
       </w:pPr>
-      <w:bookmarkStart w:id="102" w:name="_Toc244302307"/>
+      <w:bookmarkStart w:id="102" w:name="_Toc244304566"/>
       <w:r>
         <w:t>Network policies</w:t>
       </w:r>
@@ -24566,7 +24566,7 @@
         <w:pStyle w:val="u2"/>
         <w:keepNext/>
       </w:pPr>
-      <w:bookmarkStart w:id="103" w:name="_Toc244302308"/>
+      <w:bookmarkStart w:id="103" w:name="_Toc244304567"/>
       <w:r>
         <w:t>Problems encountered</w:t>
       </w:r>
@@ -24585,7 +24585,7 @@
         <w:pStyle w:val="Chuthich"/>
         <w:keepNext/>
       </w:pPr>
-      <w:bookmarkStart w:id="104" w:name="_Toc244302360"/>
+      <w:bookmarkStart w:id="104" w:name="_Toc244304619"/>
       <w:r>
         <w:lastRenderedPageBreak/>
         <w:t xml:space="preserve">Table </w:t>
@@ -25222,7 +25222,7 @@
         <w:pStyle w:val="u2"/>
         <w:keepNext/>
       </w:pPr>
-      <w:bookmarkStart w:id="105" w:name="_Toc244302309"/>
+      <w:bookmarkStart w:id="105" w:name="_Toc244304568"/>
       <w:r>
         <w:lastRenderedPageBreak/>
         <w:t>Discussion</w:t>
@@ -25242,7 +25242,7 @@
         <w:pStyle w:val="Chuthich"/>
         <w:keepNext/>
       </w:pPr>
-      <w:bookmarkStart w:id="106" w:name="_Toc244302361"/>
+      <w:bookmarkStart w:id="106" w:name="_Toc244304620"/>
       <w:r>
         <w:t xml:space="preserve">Table </w:t>
       </w:r>
@@ -25923,7 +25923,7 @@
         <w:pStyle w:val="Chuthich"/>
         <w:keepNext/>
       </w:pPr>
-      <w:bookmarkStart w:id="107" w:name="_Toc244302362"/>
+      <w:bookmarkStart w:id="107" w:name="_Toc244304621"/>
       <w:r>
         <w:t xml:space="preserve">Table </w:t>
       </w:r>
@@ -26435,7 +26435,7 @@
         <w:keepNext/>
         <w:pageBreakBefore/>
       </w:pPr>
-      <w:bookmarkStart w:id="108" w:name="_Toc244302310"/>
+      <w:bookmarkStart w:id="108" w:name="_Toc244304569"/>
       <w:r>
         <w:lastRenderedPageBreak/>
         <w:t>CONCLUSION</w:t>
@@ -26447,7 +26447,7 @@
         <w:pStyle w:val="u2"/>
         <w:keepNext/>
       </w:pPr>
-      <w:bookmarkStart w:id="109" w:name="_Toc244302311"/>
+      <w:bookmarkStart w:id="109" w:name="_Toc244304570"/>
       <w:r>
         <w:t>Conclusion</w:t>
       </w:r>
@@ -26482,7 +26482,7 @@
         <w:pStyle w:val="u2"/>
         <w:keepNext/>
       </w:pPr>
-      <w:bookmarkStart w:id="110" w:name="_Toc244302312"/>
+      <w:bookmarkStart w:id="110" w:name="_Toc244304571"/>
       <w:r>
         <w:t>Potential and Development Direction</w:t>
       </w:r>
@@ -26510,7 +26510,7 @@
         </w:numPr>
         <w:jc w:val="center"/>
       </w:pPr>
-      <w:bookmarkStart w:id="111" w:name="_Toc244302313"/>
+      <w:bookmarkStart w:id="111" w:name="_Toc244304572"/>
       <w:r>
         <w:lastRenderedPageBreak/>
         <w:t>REFERENCES</w:t>
@@ -26980,7 +26980,7 @@
         </w:numPr>
         <w:jc w:val="center"/>
       </w:pPr>
-      <w:bookmarkStart w:id="112" w:name="_Toc244302314"/>
+      <w:bookmarkStart w:id="112" w:name="_Toc244304573"/>
       <w:r>
         <w:lastRenderedPageBreak/>
         <w:t>APPENDIX A. RUNNING THE PROJECT</w:t>
@@ -27260,7 +27260,7 @@
         </w:numPr>
         <w:jc w:val="center"/>
       </w:pPr>
-      <w:bookmarkStart w:id="113" w:name="_Toc244302315"/>
+      <w:bookmarkStart w:id="113" w:name="_Toc244304574"/>
       <w:r>
         <w:lastRenderedPageBreak/>
         <w:t>APPENDIX B. REST API</w:t>
@@ -33161,64 +33161,64 @@
       </w:rPr>
     </w:lvl>
   </w:abstractNum>
-  <w:num w:numId="1" w16cid:durableId="251857085">
+  <w:num w:numId="1" w16cid:durableId="2017268801">
     <w:abstractNumId w:val="2"/>
   </w:num>
-  <w:num w:numId="2" w16cid:durableId="1965039340">
+  <w:num w:numId="2" w16cid:durableId="1289777295">
     <w:abstractNumId w:val="24"/>
   </w:num>
-  <w:num w:numId="3" w16cid:durableId="1261065961">
+  <w:num w:numId="3" w16cid:durableId="1489708557">
     <w:abstractNumId w:val="33"/>
   </w:num>
-  <w:num w:numId="4" w16cid:durableId="303505250">
+  <w:num w:numId="4" w16cid:durableId="357119402">
     <w:abstractNumId w:val="41"/>
   </w:num>
-  <w:num w:numId="5" w16cid:durableId="142429545">
+  <w:num w:numId="5" w16cid:durableId="1163620429">
     <w:abstractNumId w:val="0"/>
   </w:num>
-  <w:num w:numId="6" w16cid:durableId="2058583086">
+  <w:num w:numId="6" w16cid:durableId="2143496425">
     <w:abstractNumId w:val="7"/>
   </w:num>
-  <w:num w:numId="7" w16cid:durableId="1175922165">
+  <w:num w:numId="7" w16cid:durableId="1600796597">
     <w:abstractNumId w:val="31"/>
   </w:num>
-  <w:num w:numId="8" w16cid:durableId="851721116">
+  <w:num w:numId="8" w16cid:durableId="1447044508">
     <w:abstractNumId w:val="37"/>
   </w:num>
-  <w:num w:numId="9" w16cid:durableId="698118941">
+  <w:num w:numId="9" w16cid:durableId="1025867769">
     <w:abstractNumId w:val="3"/>
   </w:num>
-  <w:num w:numId="10" w16cid:durableId="955528553">
+  <w:num w:numId="10" w16cid:durableId="1886289384">
     <w:abstractNumId w:val="18"/>
   </w:num>
-  <w:num w:numId="11" w16cid:durableId="784272191">
+  <w:num w:numId="11" w16cid:durableId="1232277605">
     <w:abstractNumId w:val="39"/>
   </w:num>
-  <w:num w:numId="12" w16cid:durableId="205409387">
+  <w:num w:numId="12" w16cid:durableId="249044623">
     <w:abstractNumId w:val="43"/>
   </w:num>
-  <w:num w:numId="13" w16cid:durableId="452866175">
+  <w:num w:numId="13" w16cid:durableId="713820069">
     <w:abstractNumId w:val="13"/>
   </w:num>
-  <w:num w:numId="14" w16cid:durableId="1390693929">
+  <w:num w:numId="14" w16cid:durableId="177429447">
     <w:abstractNumId w:val="27"/>
   </w:num>
-  <w:num w:numId="15" w16cid:durableId="1869902746">
+  <w:num w:numId="15" w16cid:durableId="951285302">
     <w:abstractNumId w:val="26"/>
   </w:num>
-  <w:num w:numId="16" w16cid:durableId="1031497264">
+  <w:num w:numId="16" w16cid:durableId="19405987">
     <w:abstractNumId w:val="17"/>
   </w:num>
-  <w:num w:numId="17" w16cid:durableId="2050257998">
+  <w:num w:numId="17" w16cid:durableId="244844829">
     <w:abstractNumId w:val="34"/>
   </w:num>
-  <w:num w:numId="18" w16cid:durableId="1411342225">
+  <w:num w:numId="18" w16cid:durableId="624971836">
     <w:abstractNumId w:val="40"/>
   </w:num>
-  <w:num w:numId="19" w16cid:durableId="1930692771">
+  <w:num w:numId="19" w16cid:durableId="1517773253">
     <w:abstractNumId w:val="5"/>
   </w:num>
-  <w:num w:numId="20" w16cid:durableId="1701202807">
+  <w:num w:numId="20" w16cid:durableId="1373844641">
     <w:abstractNumId w:val="5"/>
     <w:lvlOverride w:ilvl="0">
       <w:startOverride w:val="1"/>
@@ -33248,7 +33248,7 @@
       <w:startOverride w:val="1"/>
     </w:lvlOverride>
   </w:num>
-  <w:num w:numId="21" w16cid:durableId="2072732323">
+  <w:num w:numId="21" w16cid:durableId="731804846">
     <w:abstractNumId w:val="5"/>
     <w:lvlOverride w:ilvl="0">
       <w:startOverride w:val="1"/>
@@ -33278,88 +33278,88 @@
       <w:startOverride w:val="1"/>
     </w:lvlOverride>
   </w:num>
-  <w:num w:numId="22" w16cid:durableId="769088915">
+  <w:num w:numId="22" w16cid:durableId="1915046731">
     <w:abstractNumId w:val="5"/>
   </w:num>
-  <w:num w:numId="23" w16cid:durableId="359357057">
+  <w:num w:numId="23" w16cid:durableId="326831645">
     <w:abstractNumId w:val="35"/>
   </w:num>
-  <w:num w:numId="24" w16cid:durableId="965550237">
+  <w:num w:numId="24" w16cid:durableId="722101743">
     <w:abstractNumId w:val="12"/>
   </w:num>
-  <w:num w:numId="25" w16cid:durableId="604652008">
+  <w:num w:numId="25" w16cid:durableId="1217669043">
     <w:abstractNumId w:val="5"/>
   </w:num>
-  <w:num w:numId="26" w16cid:durableId="715932558">
+  <w:num w:numId="26" w16cid:durableId="1479376472">
     <w:abstractNumId w:val="5"/>
   </w:num>
-  <w:num w:numId="27" w16cid:durableId="632828920">
+  <w:num w:numId="27" w16cid:durableId="289559006">
     <w:abstractNumId w:val="36"/>
   </w:num>
-  <w:num w:numId="28" w16cid:durableId="1791582931">
+  <w:num w:numId="28" w16cid:durableId="325137029">
     <w:abstractNumId w:val="6"/>
   </w:num>
-  <w:num w:numId="29" w16cid:durableId="2006008868">
+  <w:num w:numId="29" w16cid:durableId="470296186">
     <w:abstractNumId w:val="22"/>
   </w:num>
-  <w:num w:numId="30" w16cid:durableId="1305542964">
+  <w:num w:numId="30" w16cid:durableId="300621672">
     <w:abstractNumId w:val="32"/>
   </w:num>
-  <w:num w:numId="31" w16cid:durableId="1611931187">
+  <w:num w:numId="31" w16cid:durableId="386496910">
     <w:abstractNumId w:val="14"/>
   </w:num>
-  <w:num w:numId="32" w16cid:durableId="1344893631">
+  <w:num w:numId="32" w16cid:durableId="2146583182">
     <w:abstractNumId w:val="4"/>
   </w:num>
-  <w:num w:numId="33" w16cid:durableId="829759931">
+  <w:num w:numId="33" w16cid:durableId="1820806034">
     <w:abstractNumId w:val="9"/>
   </w:num>
-  <w:num w:numId="34" w16cid:durableId="433865747">
+  <w:num w:numId="34" w16cid:durableId="1292975717">
     <w:abstractNumId w:val="20"/>
   </w:num>
-  <w:num w:numId="35" w16cid:durableId="134684630">
+  <w:num w:numId="35" w16cid:durableId="1413043653">
     <w:abstractNumId w:val="42"/>
   </w:num>
-  <w:num w:numId="36" w16cid:durableId="1292402372">
+  <w:num w:numId="36" w16cid:durableId="330371986">
     <w:abstractNumId w:val="21"/>
   </w:num>
-  <w:num w:numId="37" w16cid:durableId="78527268">
+  <w:num w:numId="37" w16cid:durableId="459156407">
     <w:abstractNumId w:val="28"/>
   </w:num>
-  <w:num w:numId="38" w16cid:durableId="610626374">
+  <w:num w:numId="38" w16cid:durableId="1628008675">
     <w:abstractNumId w:val="15"/>
   </w:num>
-  <w:num w:numId="39" w16cid:durableId="56830616">
+  <w:num w:numId="39" w16cid:durableId="1548564049">
     <w:abstractNumId w:val="38"/>
   </w:num>
-  <w:num w:numId="40" w16cid:durableId="609513291">
+  <w:num w:numId="40" w16cid:durableId="1919510172">
     <w:abstractNumId w:val="11"/>
   </w:num>
-  <w:num w:numId="41" w16cid:durableId="1469974998">
+  <w:num w:numId="41" w16cid:durableId="1503471887">
     <w:abstractNumId w:val="23"/>
   </w:num>
-  <w:num w:numId="42" w16cid:durableId="558787927">
+  <w:num w:numId="42" w16cid:durableId="2115857273">
     <w:abstractNumId w:val="25"/>
   </w:num>
-  <w:num w:numId="43" w16cid:durableId="532959321">
+  <w:num w:numId="43" w16cid:durableId="318270841">
     <w:abstractNumId w:val="29"/>
   </w:num>
-  <w:num w:numId="44" w16cid:durableId="1034379361">
+  <w:num w:numId="44" w16cid:durableId="1032922931">
     <w:abstractNumId w:val="30"/>
   </w:num>
-  <w:num w:numId="45" w16cid:durableId="1900552936">
+  <w:num w:numId="45" w16cid:durableId="938441972">
     <w:abstractNumId w:val="8"/>
   </w:num>
-  <w:num w:numId="46" w16cid:durableId="780220994">
+  <w:num w:numId="46" w16cid:durableId="745691927">
     <w:abstractNumId w:val="1"/>
   </w:num>
-  <w:num w:numId="47" w16cid:durableId="247495854">
+  <w:num w:numId="47" w16cid:durableId="1054475560">
     <w:abstractNumId w:val="10"/>
   </w:num>
-  <w:num w:numId="48" w16cid:durableId="607275721">
+  <w:num w:numId="48" w16cid:durableId="1307932438">
     <w:abstractNumId w:val="16"/>
   </w:num>
-  <w:num w:numId="49" w16cid:durableId="1347290446">
+  <w:num w:numId="49" w16cid:durableId="964700106">
     <w:abstractNumId w:val="19"/>
   </w:num>
 </w:numbering>

</xml_diff>